<commit_message>
API publica: seguimiento de pedidos con clave de API y Swagger (RF-OT-09)
Primera API propia en /api/publica/v1/seguimiento/{numero}/: etapa, avance, fecha estimada de entrega en dias habiles e historial del pedido. Codigo de seguimiento firmado (sin tablas nuevas), clave X-API-Key, limite de 60 consultas por minuto y registro en el log de integraciones. Documentacion en /api/publica/v1/docs/ y pagina publica /seguimiento-pedido/ que consume la API. 19 pruebas nuevas.
</commit_message>
<xml_diff>
--- a/Fase 2/Evidencias Proyecto/Evidencias de documentación/2. Metodología Scrum/REUNIONES/Acta_Sprint_Review_Sprint2_2026-10-15.docx
+++ b/Fase 2/Evidencias Proyecto/Evidencias de documentación/2. Metodología Scrum/REUNIONES/Acta_Sprint_Review_Sprint2_2026-10-15.docx
@@ -1,14 +1,13 @@
 
 <file path=word/document.xml><?xml version="1.0" encoding="utf-8"?>
-<w:document xmlns:o="urn:schemas-microsoft-com:office:office" xmlns:r="http://schemas.openxmlformats.org/officeDocument/2006/relationships" xmlns:v="urn:schemas-microsoft-com:vml" xmlns:w="http://schemas.openxmlformats.org/wordprocessingml/2006/main" xmlns:w10="urn:schemas-microsoft-com:office:word" xmlns:wp="http://schemas.openxmlformats.org/drawingml/2006/wordprocessingDrawing" xmlns:wps="http://schemas.microsoft.com/office/word/2010/wordprocessingShape" xmlns:wpg="http://schemas.microsoft.com/office/word/2010/wordprocessingGroup" xmlns:mc="http://schemas.openxmlformats.org/markup-compatibility/2006" xmlns:wp14="http://schemas.microsoft.com/office/word/2010/wordprocessingDrawing" xmlns:w14="http://schemas.microsoft.com/office/word/2010/wordml" xmlns:w15="http://schemas.microsoft.com/office/word/2012/wordml" mc:Ignorable="w14 wp14 w15">
+<w:document xmlns:wpc="http://schemas.microsoft.com/office/word/2010/wordprocessingCanvas" xmlns:cx="http://schemas.microsoft.com/office/drawing/2014/chartex" xmlns:cx1="http://schemas.microsoft.com/office/drawing/2015/9/8/chartex" xmlns:cx2="http://schemas.microsoft.com/office/drawing/2015/10/21/chartex" xmlns:cx3="http://schemas.microsoft.com/office/drawing/2016/5/9/chartex" xmlns:cx4="http://schemas.microsoft.com/office/drawing/2016/5/10/chartex" xmlns:cx5="http://schemas.microsoft.com/office/drawing/2016/5/11/chartex" xmlns:cx6="http://schemas.microsoft.com/office/drawing/2016/5/12/chartex" xmlns:cx7="http://schemas.microsoft.com/office/drawing/2016/5/13/chartex" xmlns:cx8="http://schemas.microsoft.com/office/drawing/2016/5/14/chartex" xmlns:mc="http://schemas.openxmlformats.org/markup-compatibility/2006" xmlns:aink="http://schemas.microsoft.com/office/drawing/2016/ink" xmlns:am3d="http://schemas.microsoft.com/office/drawing/2017/model3d" xmlns:o="urn:schemas-microsoft-com:office:office" xmlns:r="http://schemas.openxmlformats.org/officeDocument/2006/relationships" xmlns:m="http://schemas.openxmlformats.org/officeDocument/2006/math" xmlns:v="urn:schemas-microsoft-com:vml" xmlns:wp14="http://schemas.microsoft.com/office/word/2010/wordprocessingDrawing" xmlns:wp="http://schemas.openxmlformats.org/drawingml/2006/wordprocessingDrawing" xmlns:w10="urn:schemas-microsoft-com:office:word" xmlns:w="http://schemas.openxmlformats.org/wordprocessingml/2006/main" xmlns:w14="http://schemas.microsoft.com/office/word/2010/wordml" xmlns:w15="http://schemas.microsoft.com/office/word/2012/wordml" xmlns:w16cex="http://schemas.microsoft.com/office/word/2018/wordml/cex" xmlns:w16cid="http://schemas.microsoft.com/office/word/2016/wordml/cid" xmlns:w16="http://schemas.microsoft.com/office/word/2018/wordml" xmlns:w16sdtdh="http://schemas.microsoft.com/office/word/2020/wordml/sdtdatahash" xmlns:w16se="http://schemas.microsoft.com/office/word/2015/wordml/symex" xmlns:wpg="http://schemas.microsoft.com/office/word/2010/wordprocessingGroup" xmlns:wpi="http://schemas.microsoft.com/office/word/2010/wordprocessingInk" xmlns:wne="http://schemas.microsoft.com/office/word/2006/wordml" xmlns:wps="http://schemas.microsoft.com/office/word/2010/wordprocessingShape" mc:Ignorable="w14 w15 w16se w16cid w16 w16cex w16sdtdh wp14">
   <w:body>
     <w:p>
       <w:pPr>
-        <w:pStyle w:val="Normal"/>
-        <w:spacing w:lineRule="auto" w:line="240" w:before="0" w:after="0"/>
+        <w:spacing w:after="0" w:line="240" w:lineRule="auto"/>
         <w:jc w:val="center"/>
         <w:rPr>
-          <w:rFonts w:ascii="Arial" w:hAnsi="Arial" w:eastAsia="Times New Roman" w:cs="Arial"/>
+          <w:rFonts w:ascii="Arial" w:eastAsia="Times New Roman" w:hAnsi="Arial" w:cs="Arial"/>
           <w:b/>
           <w:color w:val="000000"/>
           <w:sz w:val="36"/>
@@ -18,7 +17,7 @@
       </w:pPr>
       <w:r>
         <w:rPr>
-          <w:rFonts w:eastAsia="Times New Roman" w:cs="Arial" w:ascii="Arial" w:hAnsi="Arial"/>
+          <w:rFonts w:ascii="Arial" w:eastAsia="Times New Roman" w:hAnsi="Arial" w:cs="Arial"/>
           <w:b/>
           <w:color w:val="000000"/>
           <w:sz w:val="36"/>
@@ -30,11 +29,10 @@
     </w:p>
     <w:p>
       <w:pPr>
-        <w:pStyle w:val="Normal"/>
-        <w:spacing w:lineRule="auto" w:line="240" w:before="0" w:after="0"/>
+        <w:spacing w:after="0" w:line="240" w:lineRule="auto"/>
         <w:jc w:val="center"/>
         <w:rPr>
-          <w:rFonts w:ascii="Arial" w:hAnsi="Arial" w:eastAsia="Times New Roman" w:cs="Arial"/>
+          <w:rFonts w:ascii="Arial" w:eastAsia="Times New Roman" w:hAnsi="Arial" w:cs="Arial"/>
           <w:b/>
           <w:color w:val="000000"/>
           <w:sz w:val="36"/>
@@ -44,7 +42,7 @@
       </w:pPr>
       <w:r>
         <w:rPr>
-          <w:rFonts w:eastAsia="Times New Roman" w:cs="Arial" w:ascii="Arial" w:hAnsi="Arial"/>
+          <w:rFonts w:ascii="Arial" w:eastAsia="Times New Roman" w:hAnsi="Arial" w:cs="Arial"/>
           <w:b/>
           <w:color w:val="000000"/>
           <w:sz w:val="36"/>
@@ -56,10 +54,9 @@
     </w:p>
     <w:p>
       <w:pPr>
-        <w:pStyle w:val="Normal"/>
-        <w:spacing w:lineRule="auto" w:line="240" w:before="0" w:after="0"/>
-        <w:rPr>
-          <w:rFonts w:ascii="Arial" w:hAnsi="Arial" w:eastAsia="Times New Roman" w:cs="Arial"/>
+        <w:spacing w:after="0" w:line="240" w:lineRule="auto"/>
+        <w:rPr>
+          <w:rFonts w:ascii="Arial" w:eastAsia="Times New Roman" w:hAnsi="Arial" w:cs="Arial"/>
           <w:b/>
           <w:color w:val="365F91"/>
           <w:sz w:val="24"/>
@@ -67,23 +64,25 @@
           <w:lang w:eastAsia="es-VE"/>
         </w:rPr>
       </w:pPr>
-      <w:r>
-        <w:rPr>
-          <w:rFonts w:eastAsia="Times New Roman" w:cs="Arial" w:ascii="Arial" w:hAnsi="Arial"/>
+    </w:p>
+    <w:p>
+      <w:pPr>
+        <w:spacing w:after="0" w:line="240" w:lineRule="auto"/>
+        <w:rPr>
+          <w:rFonts w:ascii="Arial" w:eastAsia="Times New Roman" w:hAnsi="Arial" w:cs="Arial"/>
           <w:b/>
           <w:color w:val="365F91"/>
           <w:sz w:val="24"/>
           <w:szCs w:val="24"/>
           <w:lang w:eastAsia="es-VE"/>
         </w:rPr>
-      </w:r>
-    </w:p>
-    <w:p>
-      <w:pPr>
-        <w:pStyle w:val="Normal"/>
-        <w:spacing w:lineRule="auto" w:line="240" w:before="0" w:after="0"/>
-        <w:rPr>
-          <w:rFonts w:ascii="Arial" w:hAnsi="Arial" w:eastAsia="Times New Roman" w:cs="Arial"/>
+      </w:pPr>
+    </w:p>
+    <w:p>
+      <w:pPr>
+        <w:spacing w:after="0" w:line="240" w:lineRule="auto"/>
+        <w:rPr>
+          <w:rFonts w:ascii="Arial" w:eastAsia="Times New Roman" w:hAnsi="Arial" w:cs="Arial"/>
           <w:b/>
           <w:color w:val="365F91"/>
           <w:sz w:val="24"/>
@@ -93,21 +92,21 @@
       </w:pPr>
       <w:r>
         <w:rPr>
-          <w:rFonts w:eastAsia="Times New Roman" w:cs="Arial" w:ascii="Arial" w:hAnsi="Arial"/>
+          <w:rFonts w:ascii="Arial" w:eastAsia="Times New Roman" w:hAnsi="Arial" w:cs="Arial"/>
           <w:b/>
           <w:color w:val="365F91"/>
           <w:sz w:val="24"/>
           <w:szCs w:val="24"/>
           <w:lang w:eastAsia="es-VE"/>
         </w:rPr>
-      </w:r>
-    </w:p>
-    <w:p>
-      <w:pPr>
-        <w:pStyle w:val="Normal"/>
-        <w:spacing w:lineRule="auto" w:line="240" w:before="0" w:after="0"/>
-        <w:rPr>
-          <w:rFonts w:ascii="Arial" w:hAnsi="Arial" w:eastAsia="Times New Roman" w:cs="Arial"/>
+        <w:t>Información de la empresa y proyecto:</w:t>
+      </w:r>
+    </w:p>
+    <w:p>
+      <w:pPr>
+        <w:spacing w:after="0" w:line="240" w:lineRule="auto"/>
+        <w:rPr>
+          <w:rFonts w:ascii="Arial" w:eastAsia="Times New Roman" w:hAnsi="Arial" w:cs="Arial"/>
           <w:b/>
           <w:color w:val="365F91"/>
           <w:sz w:val="24"/>
@@ -115,77 +114,34 @@
           <w:lang w:eastAsia="es-VE"/>
         </w:rPr>
       </w:pPr>
-      <w:r>
-        <w:rPr>
-          <w:rFonts w:eastAsia="Times New Roman" w:cs="Arial" w:ascii="Arial" w:hAnsi="Arial"/>
-          <w:b/>
-          <w:color w:val="365F91"/>
-          <w:sz w:val="24"/>
-          <w:szCs w:val="24"/>
-          <w:lang w:eastAsia="es-VE"/>
-        </w:rPr>
-        <w:t>Información de la empresa y proyecto:</w:t>
-      </w:r>
-    </w:p>
-    <w:p>
-      <w:pPr>
-        <w:pStyle w:val="Normal"/>
-        <w:spacing w:lineRule="auto" w:line="240" w:before="0" w:after="0"/>
-        <w:rPr>
-          <w:rFonts w:ascii="Arial" w:hAnsi="Arial" w:eastAsia="Times New Roman" w:cs="Arial"/>
-          <w:b/>
-          <w:color w:val="365F91"/>
-          <w:sz w:val="24"/>
-          <w:szCs w:val="24"/>
-          <w:lang w:eastAsia="es-VE"/>
-        </w:rPr>
-      </w:pPr>
-      <w:r>
-        <w:rPr>
-          <w:rFonts w:eastAsia="Times New Roman" w:cs="Arial" w:ascii="Arial" w:hAnsi="Arial"/>
-          <w:b/>
-          <w:color w:val="365F91"/>
-          <w:sz w:val="24"/>
-          <w:szCs w:val="24"/>
-          <w:lang w:eastAsia="es-VE"/>
-        </w:rPr>
-      </w:r>
     </w:p>
     <w:tbl>
       <w:tblPr>
         <w:tblW w:w="8870" w:type="dxa"/>
-        <w:jc w:val="start"/>
         <w:tblInd w:w="108" w:type="dxa"/>
         <w:tblLayout w:type="fixed"/>
-        <w:tblCellMar>
-          <w:top w:w="0" w:type="dxa"/>
-          <w:start w:w="108" w:type="dxa"/>
-          <w:bottom w:w="0" w:type="dxa"/>
-          <w:end w:w="108" w:type="dxa"/>
-        </w:tblCellMar>
+        <w:tblLook w:val="0000" w:firstRow="0" w:lastRow="0" w:firstColumn="0" w:lastColumn="0" w:noHBand="0" w:noVBand="0"/>
       </w:tblPr>
       <w:tblGrid>
         <w:gridCol w:w="2835"/>
         <w:gridCol w:w="6035"/>
       </w:tblGrid>
       <w:tr>
-        <w:trPr/>
         <w:tc>
           <w:tcPr>
             <w:tcW w:w="2835" w:type="dxa"/>
             <w:tcBorders>
               <w:top w:val="single" w:sz="4" w:space="0" w:color="000000"/>
-              <w:start w:val="single" w:sz="4" w:space="0" w:color="000000"/>
+              <w:left w:val="single" w:sz="4" w:space="0" w:color="000000"/>
               <w:bottom w:val="single" w:sz="4" w:space="0" w:color="000000"/>
-              <w:end w:val="single" w:sz="4" w:space="0" w:color="000000"/>
+              <w:right w:val="single" w:sz="4" w:space="0" w:color="000000"/>
             </w:tcBorders>
           </w:tcPr>
           <w:p>
             <w:pPr>
-              <w:pStyle w:val="Normal"/>
-              <w:spacing w:lineRule="auto" w:line="240" w:before="0" w:after="0"/>
-              <w:rPr>
-                <w:rFonts w:ascii="Arial" w:hAnsi="Arial" w:eastAsia="Times New Roman" w:cs="Arial"/>
+              <w:spacing w:after="0" w:line="240" w:lineRule="auto"/>
+              <w:rPr>
+                <w:rFonts w:ascii="Arial" w:eastAsia="Times New Roman" w:hAnsi="Arial" w:cs="Arial"/>
                 <w:color w:val="000000"/>
                 <w:sz w:val="24"/>
                 <w:szCs w:val="24"/>
@@ -194,7 +150,7 @@
             </w:pPr>
             <w:r>
               <w:rPr>
-                <w:rFonts w:eastAsia="Times New Roman" w:cs="Arial" w:ascii="Arial" w:hAnsi="Arial"/>
+                <w:rFonts w:ascii="Arial" w:eastAsia="Times New Roman" w:hAnsi="Arial" w:cs="Arial"/>
                 <w:color w:val="000000"/>
                 <w:sz w:val="24"/>
                 <w:szCs w:val="24"/>
@@ -209,18 +165,17 @@
             <w:tcW w:w="6035" w:type="dxa"/>
             <w:tcBorders>
               <w:top w:val="single" w:sz="4" w:space="0" w:color="000000"/>
-              <w:start w:val="single" w:sz="4" w:space="0" w:color="000000"/>
+              <w:left w:val="single" w:sz="4" w:space="0" w:color="000000"/>
               <w:bottom w:val="single" w:sz="4" w:space="0" w:color="000000"/>
-              <w:end w:val="single" w:sz="4" w:space="0" w:color="000000"/>
+              <w:right w:val="single" w:sz="4" w:space="0" w:color="000000"/>
             </w:tcBorders>
           </w:tcPr>
           <w:p>
             <w:pPr>
-              <w:pStyle w:val="Normal"/>
-              <w:snapToGrid w:val="false"/>
-              <w:spacing w:lineRule="auto" w:line="240" w:before="0" w:after="60"/>
-              <w:rPr>
-                <w:rFonts w:ascii="Arial" w:hAnsi="Arial" w:eastAsia="Times New Roman" w:cs="Arial"/>
+              <w:snapToGrid w:val="0"/>
+              <w:spacing w:after="60" w:line="240" w:lineRule="auto"/>
+              <w:rPr>
+                <w:rFonts w:ascii="Arial" w:eastAsia="Times New Roman" w:hAnsi="Arial" w:cs="Arial"/>
                 <w:color w:val="000000"/>
                 <w:sz w:val="24"/>
                 <w:szCs w:val="24"/>
@@ -238,23 +193,21 @@
         </w:tc>
       </w:tr>
       <w:tr>
-        <w:trPr/>
         <w:tc>
           <w:tcPr>
             <w:tcW w:w="2835" w:type="dxa"/>
             <w:tcBorders>
               <w:top w:val="single" w:sz="4" w:space="0" w:color="000000"/>
-              <w:start w:val="single" w:sz="4" w:space="0" w:color="000000"/>
+              <w:left w:val="single" w:sz="4" w:space="0" w:color="000000"/>
               <w:bottom w:val="single" w:sz="4" w:space="0" w:color="000000"/>
-              <w:end w:val="single" w:sz="4" w:space="0" w:color="000000"/>
+              <w:right w:val="single" w:sz="4" w:space="0" w:color="000000"/>
             </w:tcBorders>
           </w:tcPr>
           <w:p>
             <w:pPr>
-              <w:pStyle w:val="Normal"/>
-              <w:spacing w:lineRule="auto" w:line="240" w:before="0" w:after="0"/>
-              <w:rPr>
-                <w:rFonts w:ascii="Arial" w:hAnsi="Arial" w:eastAsia="Times New Roman" w:cs="Arial"/>
+              <w:spacing w:after="0" w:line="240" w:lineRule="auto"/>
+              <w:rPr>
+                <w:rFonts w:ascii="Arial" w:eastAsia="Times New Roman" w:hAnsi="Arial" w:cs="Arial"/>
                 <w:color w:val="000000"/>
                 <w:sz w:val="24"/>
                 <w:szCs w:val="24"/>
@@ -263,7 +216,7 @@
             </w:pPr>
             <w:r>
               <w:rPr>
-                <w:rFonts w:eastAsia="Times New Roman" w:cs="Arial" w:ascii="Arial" w:hAnsi="Arial"/>
+                <w:rFonts w:ascii="Arial" w:eastAsia="Times New Roman" w:hAnsi="Arial" w:cs="Arial"/>
                 <w:color w:val="000000"/>
                 <w:sz w:val="24"/>
                 <w:szCs w:val="24"/>
@@ -278,18 +231,17 @@
             <w:tcW w:w="6035" w:type="dxa"/>
             <w:tcBorders>
               <w:top w:val="single" w:sz="4" w:space="0" w:color="000000"/>
-              <w:start w:val="single" w:sz="4" w:space="0" w:color="000000"/>
+              <w:left w:val="single" w:sz="4" w:space="0" w:color="000000"/>
               <w:bottom w:val="single" w:sz="4" w:space="0" w:color="000000"/>
-              <w:end w:val="single" w:sz="4" w:space="0" w:color="000000"/>
+              <w:right w:val="single" w:sz="4" w:space="0" w:color="000000"/>
             </w:tcBorders>
           </w:tcPr>
           <w:p>
             <w:pPr>
-              <w:pStyle w:val="Normal"/>
-              <w:snapToGrid w:val="false"/>
-              <w:spacing w:lineRule="auto" w:line="240" w:before="0" w:after="60"/>
-              <w:rPr>
-                <w:rFonts w:ascii="Arial" w:hAnsi="Arial" w:eastAsia="Times New Roman" w:cs="Arial"/>
+              <w:snapToGrid w:val="0"/>
+              <w:spacing w:after="60" w:line="240" w:lineRule="auto"/>
+              <w:rPr>
+                <w:rFonts w:ascii="Arial" w:eastAsia="Times New Roman" w:hAnsi="Arial" w:cs="Arial"/>
                 <w:color w:val="000000"/>
                 <w:sz w:val="24"/>
                 <w:szCs w:val="24"/>
@@ -301,7 +253,14 @@
                 <w:rFonts w:ascii="Arial" w:hAnsi="Arial"/>
                 <w:sz w:val="20"/>
               </w:rPr>
-              <w:t>SITRAFO — Sistema Integral de Gestión Comercial y Productiva para Fabricación de Transformadores Eléctricos</w:t>
+              <w:t xml:space="preserve">SITRAFO — Sistema Integral de Gestión Comercial y Productiva para </w:t>
+            </w:r>
+            <w:r>
+              <w:rPr>
+                <w:rFonts w:ascii="Arial" w:hAnsi="Arial"/>
+                <w:sz w:val="20"/>
+              </w:rPr>
+              <w:t>Fabricación de Transformadores Eléctricos</w:t>
             </w:r>
           </w:p>
         </w:tc>
@@ -309,10 +268,9 @@
     </w:tbl>
     <w:p>
       <w:pPr>
-        <w:pStyle w:val="Normal"/>
-        <w:spacing w:lineRule="auto" w:line="240" w:before="0" w:after="0"/>
-        <w:rPr>
-          <w:rFonts w:ascii="Arial" w:hAnsi="Arial" w:eastAsia="Times New Roman" w:cs="Arial"/>
+        <w:spacing w:after="0" w:line="240" w:lineRule="auto"/>
+        <w:rPr>
+          <w:rFonts w:ascii="Arial" w:eastAsia="Times New Roman" w:hAnsi="Arial" w:cs="Arial"/>
           <w:b/>
           <w:color w:val="365F91"/>
           <w:sz w:val="24"/>
@@ -320,101 +278,71 @@
           <w:lang w:eastAsia="es-VE"/>
         </w:rPr>
       </w:pPr>
-      <w:r>
-        <w:rPr>
-          <w:rFonts w:eastAsia="Times New Roman" w:cs="Arial" w:ascii="Arial" w:hAnsi="Arial"/>
+    </w:p>
+    <w:p>
+      <w:pPr>
+        <w:spacing w:after="0" w:line="240" w:lineRule="auto"/>
+        <w:rPr>
+          <w:rFonts w:ascii="Arial" w:eastAsia="Times New Roman" w:hAnsi="Arial" w:cs="Arial"/>
           <w:b/>
           <w:color w:val="365F91"/>
           <w:sz w:val="24"/>
           <w:szCs w:val="24"/>
           <w:lang w:eastAsia="es-VE"/>
         </w:rPr>
-      </w:r>
-    </w:p>
-    <w:p>
-      <w:pPr>
-        <w:pStyle w:val="Normal"/>
-        <w:spacing w:lineRule="auto" w:line="240" w:before="0" w:after="0"/>
-        <w:rPr>
-          <w:rFonts w:ascii="Arial" w:hAnsi="Arial" w:eastAsia="Times New Roman" w:cs="Arial"/>
+      </w:pPr>
+      <w:r>
+        <w:rPr>
+          <w:rFonts w:ascii="Arial" w:eastAsia="Times New Roman" w:hAnsi="Arial" w:cs="Arial"/>
           <w:b/>
           <w:color w:val="365F91"/>
           <w:sz w:val="24"/>
           <w:szCs w:val="24"/>
           <w:lang w:eastAsia="es-VE"/>
         </w:rPr>
-      </w:pPr>
-      <w:r>
-        <w:rPr>
-          <w:rFonts w:eastAsia="Times New Roman" w:cs="Arial" w:ascii="Arial" w:hAnsi="Arial"/>
+        <w:t>Información de la reunión:</w:t>
+      </w:r>
+    </w:p>
+    <w:p>
+      <w:pPr>
+        <w:spacing w:after="0" w:line="240" w:lineRule="auto"/>
+        <w:rPr>
+          <w:rFonts w:ascii="Arial" w:eastAsia="Times New Roman" w:hAnsi="Arial" w:cs="Arial"/>
           <w:b/>
           <w:color w:val="365F91"/>
           <w:sz w:val="24"/>
           <w:szCs w:val="24"/>
           <w:lang w:eastAsia="es-VE"/>
         </w:rPr>
-        <w:t>Información de la reunión:</w:t>
-      </w:r>
-    </w:p>
-    <w:p>
-      <w:pPr>
-        <w:pStyle w:val="Normal"/>
-        <w:spacing w:lineRule="auto" w:line="240" w:before="0" w:after="0"/>
-        <w:rPr>
-          <w:rFonts w:ascii="Arial" w:hAnsi="Arial" w:eastAsia="Times New Roman" w:cs="Arial"/>
-          <w:b/>
-          <w:color w:val="365F91"/>
-          <w:sz w:val="24"/>
-          <w:szCs w:val="24"/>
-          <w:lang w:eastAsia="es-VE"/>
-        </w:rPr>
-      </w:pPr>
-      <w:r>
-        <w:rPr>
-          <w:rFonts w:eastAsia="Times New Roman" w:cs="Arial" w:ascii="Arial" w:hAnsi="Arial"/>
-          <w:b/>
-          <w:color w:val="365F91"/>
-          <w:sz w:val="24"/>
-          <w:szCs w:val="24"/>
-          <w:lang w:eastAsia="es-VE"/>
-        </w:rPr>
-      </w:r>
+      </w:pPr>
     </w:p>
     <w:tbl>
       <w:tblPr>
         <w:tblW w:w="8870" w:type="dxa"/>
-        <w:jc w:val="start"/>
         <w:tblInd w:w="108" w:type="dxa"/>
         <w:tblLayout w:type="fixed"/>
-        <w:tblCellMar>
-          <w:top w:w="0" w:type="dxa"/>
-          <w:start w:w="108" w:type="dxa"/>
-          <w:bottom w:w="0" w:type="dxa"/>
-          <w:end w:w="108" w:type="dxa"/>
-        </w:tblCellMar>
+        <w:tblLook w:val="0000" w:firstRow="0" w:lastRow="0" w:firstColumn="0" w:lastColumn="0" w:noHBand="0" w:noVBand="0"/>
       </w:tblPr>
       <w:tblGrid>
         <w:gridCol w:w="3261"/>
         <w:gridCol w:w="5609"/>
       </w:tblGrid>
       <w:tr>
-        <w:trPr/>
         <w:tc>
           <w:tcPr>
             <w:tcW w:w="3261" w:type="dxa"/>
             <w:tcBorders>
               <w:top w:val="single" w:sz="4" w:space="0" w:color="000000"/>
-              <w:start w:val="single" w:sz="4" w:space="0" w:color="000000"/>
+              <w:left w:val="single" w:sz="4" w:space="0" w:color="000000"/>
               <w:bottom w:val="single" w:sz="4" w:space="0" w:color="000000"/>
-              <w:end w:val="single" w:sz="4" w:space="0" w:color="000000"/>
+              <w:right w:val="single" w:sz="4" w:space="0" w:color="000000"/>
             </w:tcBorders>
           </w:tcPr>
           <w:p>
             <w:pPr>
-              <w:pStyle w:val="Normal"/>
-              <w:spacing w:lineRule="auto" w:line="240" w:before="0" w:after="0"/>
-              <w:rPr>
-                <w:rFonts w:ascii="Arial" w:hAnsi="Arial" w:eastAsia="Times New Roman" w:cs="Arial"/>
+              <w:spacing w:after="0" w:line="240" w:lineRule="auto"/>
+              <w:rPr>
+                <w:rFonts w:ascii="Arial" w:eastAsia="Times New Roman" w:hAnsi="Arial" w:cs="Arial"/>
                 <w:color w:val="000000"/>
                 <w:sz w:val="24"/>
                 <w:szCs w:val="24"/>
@@ -423,7 +351,7 @@
             </w:pPr>
             <w:r>
               <w:rPr>
-                <w:rFonts w:eastAsia="Times New Roman" w:cs="Arial" w:ascii="Arial" w:hAnsi="Arial"/>
+                <w:rFonts w:ascii="Arial" w:eastAsia="Times New Roman" w:hAnsi="Arial" w:cs="Arial"/>
                 <w:color w:val="000000"/>
                 <w:sz w:val="24"/>
                 <w:szCs w:val="24"/>
@@ -438,18 +366,17 @@
             <w:tcW w:w="5609" w:type="dxa"/>
             <w:tcBorders>
               <w:top w:val="single" w:sz="4" w:space="0" w:color="000000"/>
-              <w:start w:val="single" w:sz="4" w:space="0" w:color="000000"/>
+              <w:left w:val="single" w:sz="4" w:space="0" w:color="000000"/>
               <w:bottom w:val="single" w:sz="4" w:space="0" w:color="000000"/>
-              <w:end w:val="single" w:sz="4" w:space="0" w:color="000000"/>
+              <w:right w:val="single" w:sz="4" w:space="0" w:color="000000"/>
             </w:tcBorders>
           </w:tcPr>
           <w:p>
             <w:pPr>
-              <w:pStyle w:val="Normal"/>
-              <w:snapToGrid w:val="false"/>
-              <w:spacing w:lineRule="auto" w:line="240" w:before="0" w:after="60"/>
-              <w:rPr>
-                <w:rFonts w:ascii="Arial" w:hAnsi="Arial" w:eastAsia="Times New Roman" w:cs="Arial"/>
+              <w:snapToGrid w:val="0"/>
+              <w:spacing w:after="60" w:line="240" w:lineRule="auto"/>
+              <w:rPr>
+                <w:rFonts w:ascii="Arial" w:eastAsia="Times New Roman" w:hAnsi="Arial" w:cs="Arial"/>
                 <w:color w:val="000000"/>
                 <w:sz w:val="24"/>
                 <w:szCs w:val="24"/>
@@ -467,23 +394,21 @@
         </w:tc>
       </w:tr>
       <w:tr>
-        <w:trPr/>
         <w:tc>
           <w:tcPr>
             <w:tcW w:w="3261" w:type="dxa"/>
             <w:tcBorders>
               <w:top w:val="single" w:sz="4" w:space="0" w:color="000000"/>
-              <w:start w:val="single" w:sz="4" w:space="0" w:color="000000"/>
+              <w:left w:val="single" w:sz="4" w:space="0" w:color="000000"/>
               <w:bottom w:val="single" w:sz="4" w:space="0" w:color="000000"/>
-              <w:end w:val="single" w:sz="4" w:space="0" w:color="000000"/>
+              <w:right w:val="single" w:sz="4" w:space="0" w:color="000000"/>
             </w:tcBorders>
           </w:tcPr>
           <w:p>
             <w:pPr>
-              <w:pStyle w:val="Normal"/>
-              <w:spacing w:lineRule="auto" w:line="240" w:before="0" w:after="0"/>
-              <w:rPr>
-                <w:rFonts w:ascii="Arial" w:hAnsi="Arial" w:eastAsia="Times New Roman" w:cs="Arial"/>
+              <w:spacing w:after="0" w:line="240" w:lineRule="auto"/>
+              <w:rPr>
+                <w:rFonts w:ascii="Arial" w:eastAsia="Times New Roman" w:hAnsi="Arial" w:cs="Arial"/>
                 <w:color w:val="000000"/>
                 <w:sz w:val="24"/>
                 <w:szCs w:val="24"/>
@@ -492,7 +417,7 @@
             </w:pPr>
             <w:r>
               <w:rPr>
-                <w:rFonts w:eastAsia="Times New Roman" w:cs="Arial" w:ascii="Arial" w:hAnsi="Arial"/>
+                <w:rFonts w:ascii="Arial" w:eastAsia="Times New Roman" w:hAnsi="Arial" w:cs="Arial"/>
                 <w:color w:val="000000"/>
                 <w:sz w:val="24"/>
                 <w:szCs w:val="24"/>
@@ -507,18 +432,17 @@
             <w:tcW w:w="5609" w:type="dxa"/>
             <w:tcBorders>
               <w:top w:val="single" w:sz="4" w:space="0" w:color="000000"/>
-              <w:start w:val="single" w:sz="4" w:space="0" w:color="000000"/>
+              <w:left w:val="single" w:sz="4" w:space="0" w:color="000000"/>
               <w:bottom w:val="single" w:sz="4" w:space="0" w:color="000000"/>
-              <w:end w:val="single" w:sz="4" w:space="0" w:color="000000"/>
+              <w:right w:val="single" w:sz="4" w:space="0" w:color="000000"/>
             </w:tcBorders>
           </w:tcPr>
           <w:p>
             <w:pPr>
-              <w:pStyle w:val="Normal"/>
-              <w:snapToGrid w:val="false"/>
-              <w:spacing w:lineRule="auto" w:line="240" w:before="0" w:after="60"/>
-              <w:rPr>
-                <w:rFonts w:ascii="Arial" w:hAnsi="Arial" w:eastAsia="Times New Roman" w:cs="Arial"/>
+              <w:snapToGrid w:val="0"/>
+              <w:spacing w:after="60" w:line="240" w:lineRule="auto"/>
+              <w:rPr>
+                <w:rFonts w:ascii="Arial" w:eastAsia="Times New Roman" w:hAnsi="Arial" w:cs="Arial"/>
                 <w:color w:val="000000"/>
                 <w:sz w:val="24"/>
                 <w:szCs w:val="24"/>
@@ -536,23 +460,21 @@
         </w:tc>
       </w:tr>
       <w:tr>
-        <w:trPr/>
         <w:tc>
           <w:tcPr>
             <w:tcW w:w="3261" w:type="dxa"/>
             <w:tcBorders>
               <w:top w:val="single" w:sz="4" w:space="0" w:color="000000"/>
-              <w:start w:val="single" w:sz="4" w:space="0" w:color="000000"/>
+              <w:left w:val="single" w:sz="4" w:space="0" w:color="000000"/>
               <w:bottom w:val="single" w:sz="4" w:space="0" w:color="000000"/>
-              <w:end w:val="single" w:sz="4" w:space="0" w:color="000000"/>
+              <w:right w:val="single" w:sz="4" w:space="0" w:color="000000"/>
             </w:tcBorders>
           </w:tcPr>
           <w:p>
             <w:pPr>
-              <w:pStyle w:val="Normal"/>
-              <w:spacing w:lineRule="auto" w:line="240" w:before="0" w:after="0"/>
-              <w:rPr>
-                <w:rFonts w:ascii="Arial" w:hAnsi="Arial" w:eastAsia="Times New Roman" w:cs="Arial"/>
+              <w:spacing w:after="0" w:line="240" w:lineRule="auto"/>
+              <w:rPr>
+                <w:rFonts w:ascii="Arial" w:eastAsia="Times New Roman" w:hAnsi="Arial" w:cs="Arial"/>
                 <w:color w:val="000000"/>
                 <w:sz w:val="24"/>
                 <w:szCs w:val="24"/>
@@ -561,7 +483,7 @@
             </w:pPr>
             <w:r>
               <w:rPr>
-                <w:rFonts w:eastAsia="Times New Roman" w:cs="Arial" w:ascii="Arial" w:hAnsi="Arial"/>
+                <w:rFonts w:ascii="Arial" w:eastAsia="Times New Roman" w:hAnsi="Arial" w:cs="Arial"/>
                 <w:color w:val="000000"/>
                 <w:sz w:val="24"/>
                 <w:szCs w:val="24"/>
@@ -576,18 +498,17 @@
             <w:tcW w:w="5609" w:type="dxa"/>
             <w:tcBorders>
               <w:top w:val="single" w:sz="4" w:space="0" w:color="000000"/>
-              <w:start w:val="single" w:sz="4" w:space="0" w:color="000000"/>
+              <w:left w:val="single" w:sz="4" w:space="0" w:color="000000"/>
               <w:bottom w:val="single" w:sz="4" w:space="0" w:color="000000"/>
-              <w:end w:val="single" w:sz="4" w:space="0" w:color="000000"/>
+              <w:right w:val="single" w:sz="4" w:space="0" w:color="000000"/>
             </w:tcBorders>
           </w:tcPr>
           <w:p>
             <w:pPr>
-              <w:pStyle w:val="Normal"/>
-              <w:snapToGrid w:val="false"/>
-              <w:spacing w:lineRule="auto" w:line="240" w:before="0" w:after="60"/>
-              <w:rPr>
-                <w:rFonts w:ascii="Arial" w:hAnsi="Arial" w:eastAsia="Times New Roman" w:cs="Arial"/>
+              <w:snapToGrid w:val="0"/>
+              <w:spacing w:after="60" w:line="240" w:lineRule="auto"/>
+              <w:rPr>
+                <w:rFonts w:ascii="Arial" w:eastAsia="Times New Roman" w:hAnsi="Arial" w:cs="Arial"/>
                 <w:color w:val="000000"/>
                 <w:sz w:val="24"/>
                 <w:szCs w:val="24"/>
@@ -599,29 +520,34 @@
                 <w:rFonts w:ascii="Arial" w:hAnsi="Arial"/>
                 <w:sz w:val="20"/>
               </w:rPr>
-              <w:t>Sprint 2 — despliegue, documentación y verificación de calidad (29 de septiembre al 15 de octubre de 2026)</w:t>
+              <w:t xml:space="preserve">Sprint 2 — despliegue, documentación y verificación de calidad (29 de </w:t>
+            </w:r>
+            <w:r>
+              <w:rPr>
+                <w:rFonts w:ascii="Arial" w:hAnsi="Arial"/>
+                <w:sz w:val="20"/>
+              </w:rPr>
+              <w:t>septiembre al 15 de octubre de 2026)</w:t>
             </w:r>
           </w:p>
         </w:tc>
       </w:tr>
       <w:tr>
-        <w:trPr/>
         <w:tc>
           <w:tcPr>
             <w:tcW w:w="3261" w:type="dxa"/>
             <w:tcBorders>
               <w:top w:val="single" w:sz="4" w:space="0" w:color="000000"/>
-              <w:start w:val="single" w:sz="4" w:space="0" w:color="000000"/>
+              <w:left w:val="single" w:sz="4" w:space="0" w:color="000000"/>
               <w:bottom w:val="single" w:sz="4" w:space="0" w:color="000000"/>
-              <w:end w:val="single" w:sz="4" w:space="0" w:color="000000"/>
+              <w:right w:val="single" w:sz="4" w:space="0" w:color="000000"/>
             </w:tcBorders>
           </w:tcPr>
           <w:p>
             <w:pPr>
-              <w:pStyle w:val="Normal"/>
-              <w:spacing w:lineRule="auto" w:line="240" w:before="0" w:after="0"/>
-              <w:rPr>
-                <w:rFonts w:ascii="Arial" w:hAnsi="Arial" w:eastAsia="Times New Roman" w:cs="Arial"/>
+              <w:spacing w:after="0" w:line="240" w:lineRule="auto"/>
+              <w:rPr>
+                <w:rFonts w:ascii="Arial" w:eastAsia="Times New Roman" w:hAnsi="Arial" w:cs="Arial"/>
                 <w:color w:val="000000"/>
                 <w:sz w:val="24"/>
                 <w:szCs w:val="24"/>
@@ -630,7 +556,7 @@
             </w:pPr>
             <w:r>
               <w:rPr>
-                <w:rFonts w:eastAsia="Times New Roman" w:cs="Arial" w:ascii="Arial" w:hAnsi="Arial"/>
+                <w:rFonts w:ascii="Arial" w:eastAsia="Times New Roman" w:hAnsi="Arial" w:cs="Arial"/>
                 <w:color w:val="000000"/>
                 <w:sz w:val="24"/>
                 <w:szCs w:val="24"/>
@@ -645,18 +571,17 @@
             <w:tcW w:w="5609" w:type="dxa"/>
             <w:tcBorders>
               <w:top w:val="single" w:sz="4" w:space="0" w:color="000000"/>
-              <w:start w:val="single" w:sz="4" w:space="0" w:color="000000"/>
+              <w:left w:val="single" w:sz="4" w:space="0" w:color="000000"/>
               <w:bottom w:val="single" w:sz="4" w:space="0" w:color="000000"/>
-              <w:end w:val="single" w:sz="4" w:space="0" w:color="000000"/>
+              <w:right w:val="single" w:sz="4" w:space="0" w:color="000000"/>
             </w:tcBorders>
           </w:tcPr>
           <w:p>
             <w:pPr>
-              <w:pStyle w:val="Normal"/>
-              <w:snapToGrid w:val="false"/>
-              <w:spacing w:lineRule="auto" w:line="240" w:before="0" w:after="60"/>
-              <w:rPr>
-                <w:rFonts w:ascii="Arial" w:hAnsi="Arial" w:eastAsia="Times New Roman" w:cs="Arial"/>
+              <w:snapToGrid w:val="0"/>
+              <w:spacing w:after="60" w:line="240" w:lineRule="auto"/>
+              <w:rPr>
+                <w:rFonts w:ascii="Arial" w:eastAsia="Times New Roman" w:hAnsi="Arial" w:cs="Arial"/>
                 <w:color w:val="000000"/>
                 <w:sz w:val="24"/>
                 <w:szCs w:val="24"/>
@@ -710,23 +635,21 @@
         </w:tc>
       </w:tr>
       <w:tr>
-        <w:trPr/>
         <w:tc>
           <w:tcPr>
             <w:tcW w:w="3261" w:type="dxa"/>
             <w:tcBorders>
               <w:top w:val="single" w:sz="4" w:space="0" w:color="000000"/>
-              <w:start w:val="single" w:sz="4" w:space="0" w:color="000000"/>
+              <w:left w:val="single" w:sz="4" w:space="0" w:color="000000"/>
               <w:bottom w:val="single" w:sz="4" w:space="0" w:color="000000"/>
-              <w:end w:val="single" w:sz="4" w:space="0" w:color="000000"/>
+              <w:right w:val="single" w:sz="4" w:space="0" w:color="000000"/>
             </w:tcBorders>
           </w:tcPr>
           <w:p>
             <w:pPr>
-              <w:pStyle w:val="Normal"/>
-              <w:spacing w:lineRule="auto" w:line="240" w:before="0" w:after="0"/>
-              <w:rPr>
-                <w:rFonts w:ascii="Arial" w:hAnsi="Arial" w:eastAsia="Times New Roman" w:cs="Arial"/>
+              <w:spacing w:after="0" w:line="240" w:lineRule="auto"/>
+              <w:rPr>
+                <w:rFonts w:ascii="Arial" w:eastAsia="Times New Roman" w:hAnsi="Arial" w:cs="Arial"/>
                 <w:color w:val="000000"/>
                 <w:sz w:val="24"/>
                 <w:szCs w:val="24"/>
@@ -735,13 +658,23 @@
             </w:pPr>
             <w:r>
               <w:rPr>
-                <w:rFonts w:eastAsia="Times New Roman" w:cs="Arial" w:ascii="Arial" w:hAnsi="Arial"/>
+                <w:rFonts w:ascii="Arial" w:eastAsia="Times New Roman" w:hAnsi="Arial" w:cs="Arial"/>
                 <w:color w:val="000000"/>
                 <w:sz w:val="24"/>
                 <w:szCs w:val="24"/>
                 <w:lang w:eastAsia="es-VE"/>
               </w:rPr>
-              <w:t>Personas que asistieron a la reunión</w:t>
+              <w:t xml:space="preserve">Personas que asistieron a la </w:t>
+            </w:r>
+            <w:r>
+              <w:rPr>
+                <w:rFonts w:ascii="Arial" w:eastAsia="Times New Roman" w:hAnsi="Arial" w:cs="Arial"/>
+                <w:color w:val="000000"/>
+                <w:sz w:val="24"/>
+                <w:szCs w:val="24"/>
+                <w:lang w:eastAsia="es-VE"/>
+              </w:rPr>
+              <w:t>reunión</w:t>
             </w:r>
           </w:p>
         </w:tc>
@@ -750,18 +683,17 @@
             <w:tcW w:w="5609" w:type="dxa"/>
             <w:tcBorders>
               <w:top w:val="single" w:sz="4" w:space="0" w:color="000000"/>
-              <w:start w:val="single" w:sz="4" w:space="0" w:color="000000"/>
+              <w:left w:val="single" w:sz="4" w:space="0" w:color="000000"/>
               <w:bottom w:val="single" w:sz="4" w:space="0" w:color="000000"/>
-              <w:end w:val="single" w:sz="4" w:space="0" w:color="000000"/>
+              <w:right w:val="single" w:sz="4" w:space="0" w:color="000000"/>
             </w:tcBorders>
           </w:tcPr>
           <w:p>
             <w:pPr>
-              <w:pStyle w:val="Normal"/>
-              <w:snapToGrid w:val="false"/>
-              <w:spacing w:lineRule="auto" w:line="240" w:before="0" w:after="60"/>
-              <w:rPr>
-                <w:rFonts w:ascii="Arial" w:hAnsi="Arial" w:eastAsia="Times New Roman" w:cs="Arial"/>
+              <w:snapToGrid w:val="0"/>
+              <w:spacing w:after="60" w:line="240" w:lineRule="auto"/>
+              <w:rPr>
+                <w:rFonts w:ascii="Arial" w:eastAsia="Times New Roman" w:hAnsi="Arial" w:cs="Arial"/>
                 <w:color w:val="000000"/>
                 <w:sz w:val="24"/>
                 <w:szCs w:val="24"/>
@@ -781,10 +713,9 @@
     </w:tbl>
     <w:p>
       <w:pPr>
-        <w:pStyle w:val="Normal"/>
-        <w:spacing w:lineRule="auto" w:line="240" w:before="0" w:after="0"/>
-        <w:rPr>
-          <w:rFonts w:ascii="Arial" w:hAnsi="Arial" w:eastAsia="Times New Roman" w:cs="Arial"/>
+        <w:spacing w:after="0" w:line="240" w:lineRule="auto"/>
+        <w:rPr>
+          <w:rFonts w:ascii="Arial" w:eastAsia="Times New Roman" w:hAnsi="Arial" w:cs="Arial"/>
           <w:b/>
           <w:color w:val="365F91"/>
           <w:sz w:val="24"/>
@@ -792,16 +723,6 @@
           <w:lang w:eastAsia="es-VE"/>
         </w:rPr>
       </w:pPr>
-      <w:r>
-        <w:rPr>
-          <w:rFonts w:eastAsia="Times New Roman" w:cs="Arial" w:ascii="Arial" w:hAnsi="Arial"/>
-          <w:b/>
-          <w:color w:val="365F91"/>
-          <w:sz w:val="24"/>
-          <w:szCs w:val="24"/>
-          <w:lang w:eastAsia="es-VE"/>
-        </w:rPr>
-      </w:r>
     </w:p>
     <w:p>
       <w:pPr>
@@ -822,7 +743,14 @@
           <w:rFonts w:ascii="Arial" w:hAnsi="Arial"/>
           <w:sz w:val="20"/>
         </w:rPr>
-        <w:t>Dejar el sistema desplegado y verificable en producción, completar los requerimientos pendientes de la ERS y la documentación de análisis y diseño, y comenzar la verificación de calidad del producto.</w:t>
+        <w:t xml:space="preserve">Dejar el sistema desplegado y verificable en producción, completar los requerimientos pendientes de la ERS y la documentación de análisis y diseño, y comenzar la verificación de </w:t>
+      </w:r>
+      <w:r>
+        <w:rPr>
+          <w:rFonts w:ascii="Arial" w:hAnsi="Arial"/>
+          <w:sz w:val="20"/>
+        </w:rPr>
+        <w:t>calidad del producto.</w:t>
       </w:r>
     </w:p>
     <w:p>
@@ -844,6 +772,7 @@
           <w:rFonts w:ascii="Arial" w:hAnsi="Arial"/>
           <w:sz w:val="20"/>
         </w:rPr>
+        <w:lastRenderedPageBreak/>
         <w:t>• Sistema publicado en https://sitrafo.onrender.com y aplicación de escritorio distribuible (SITRAFO.exe) conectada a la API.</w:t>
       </w:r>
     </w:p>
@@ -853,15 +782,22 @@
           <w:rFonts w:ascii="Arial" w:hAnsi="Arial"/>
           <w:sz w:val="20"/>
         </w:rPr>
-        <w:t>• Recorrido de extremo a extremo: solicitud web, costeo y cotización, aprobación por otro usuario, correo con PDF, orden de compra automática, pago del anticipo con PayPal, órdenes de trabajo automáticas, taller, control de calidad con aprobación, cierre, saldo y entrega.</w:t>
-      </w:r>
-    </w:p>
-    <w:p>
+        <w:t>• Recorrido de extremo a extremo: solicitud web, costeo y cotización, aprobación por o</w:t>
+      </w:r>
       <w:r>
         <w:rPr>
           <w:rFonts w:ascii="Arial" w:hAnsi="Arial"/>
           <w:sz w:val="20"/>
         </w:rPr>
+        <w:t>tro usuario, correo con PDF, orden de compra automática, pago del anticipo con PayPal, órdenes de trabajo automáticas, taller, control de calidad con aprobación, cierre, saldo y entrega.</w:t>
+      </w:r>
+    </w:p>
+    <w:p>
+      <w:r>
+        <w:rPr>
+          <w:rFonts w:ascii="Arial" w:hAnsi="Arial"/>
+          <w:sz w:val="20"/>
+        </w:rPr>
         <w:t>• Bandeja de pendientes por rol y avisos por correo entre roles.</w:t>
       </w:r>
     </w:p>
@@ -871,16 +807,30 @@
           <w:rFonts w:ascii="Arial" w:hAnsi="Arial"/>
           <w:sz w:val="20"/>
         </w:rPr>
-        <w:t>• Documentación actualizada: ERS-01, CU-01 v2.2, MER-01 v2.1, ARQ-01, SEC-01, MOC-01, EVI-01, MET-01 y manual de usuario MAN-01.</w:t>
-      </w:r>
-    </w:p>
-    <w:p>
+        <w:t>• Do</w:t>
+      </w:r>
       <w:r>
         <w:rPr>
           <w:rFonts w:ascii="Arial" w:hAnsi="Arial"/>
           <w:sz w:val="20"/>
         </w:rPr>
-        <w:t>• Pruebas: 187 pruebas automatizadas (91 % de cobertura) en la integración continua, análisis OWASP ZAP, prueba de carga con 30 usuarios y pruebas de interfaz del portal con Selenium.</w:t>
+        <w:t>cumentación actualizada: ERS-01, CU-01 v2.2, MER-01 v2.1, ARQ-01, SEC-01, MOC-01, EVI-01, MET-01 y manual de usuario MAN-01.</w:t>
+      </w:r>
+    </w:p>
+    <w:p>
+      <w:r>
+        <w:rPr>
+          <w:rFonts w:ascii="Arial" w:hAnsi="Arial"/>
+          <w:sz w:val="20"/>
+        </w:rPr>
+        <w:t>• Pruebas: 187 pruebas automatizadas (91 % de cobertura) en la integración continua, análisis OWASP ZAP, prueba de carga con 30 usu</w:t>
+      </w:r>
+      <w:r>
+        <w:rPr>
+          <w:rFonts w:ascii="Arial" w:hAnsi="Arial"/>
+          <w:sz w:val="20"/>
+        </w:rPr>
+        <w:t>arios y pruebas de interfaz del portal con Selenium.</w:t>
       </w:r>
     </w:p>
     <w:p>
@@ -933,6 +883,22 @@
           <w:rFonts w:ascii="Arial" w:hAnsi="Arial"/>
           <w:sz w:val="20"/>
         </w:rPr>
+        <w:t>_____</w:t>
+      </w:r>
+      <w:r>
+        <w:rPr>
+          <w:rFonts w:ascii="Arial" w:hAnsi="Arial"/>
+          <w:sz w:val="20"/>
+        </w:rPr>
+        <w:t>_________________________________________________________________________</w:t>
+      </w:r>
+    </w:p>
+    <w:p>
+      <w:r>
+        <w:rPr>
+          <w:rFonts w:ascii="Arial" w:hAnsi="Arial"/>
+          <w:sz w:val="20"/>
+        </w:rPr>
         <w:t>______________________________________________________________________________</w:t>
       </w:r>
     </w:p>
@@ -951,16 +917,14 @@
           <w:rFonts w:ascii="Arial" w:hAnsi="Arial"/>
           <w:sz w:val="20"/>
         </w:rPr>
-        <w:t>______________________________________________________________________________</w:t>
-      </w:r>
-    </w:p>
-    <w:p>
+        <w:t>________________________</w:t>
+      </w:r>
       <w:r>
         <w:rPr>
           <w:rFonts w:ascii="Arial" w:hAnsi="Arial"/>
           <w:sz w:val="20"/>
         </w:rPr>
-        <w:t>______________________________________________________________________________</w:t>
+        <w:t>______________________________________________________</w:t>
       </w:r>
     </w:p>
     <w:p>
@@ -982,6 +946,22 @@
           <w:rFonts w:ascii="Arial" w:hAnsi="Arial"/>
           <w:sz w:val="20"/>
         </w:rPr>
+        <w:t>___________________________</w:t>
+      </w:r>
+      <w:r>
+        <w:rPr>
+          <w:rFonts w:ascii="Arial" w:hAnsi="Arial"/>
+          <w:sz w:val="20"/>
+        </w:rPr>
+        <w:t>___________________________________________________</w:t>
+      </w:r>
+    </w:p>
+    <w:p>
+      <w:r>
+        <w:rPr>
+          <w:rFonts w:ascii="Arial" w:hAnsi="Arial"/>
+          <w:sz w:val="20"/>
+        </w:rPr>
         <w:t>______________________________________________________________________________</w:t>
       </w:r>
     </w:p>
@@ -991,16 +971,14 @@
           <w:rFonts w:ascii="Arial" w:hAnsi="Arial"/>
           <w:sz w:val="20"/>
         </w:rPr>
-        <w:t>______________________________________________________________________________</w:t>
-      </w:r>
-    </w:p>
-    <w:p>
+        <w:t>_____</w:t>
+      </w:r>
       <w:r>
         <w:rPr>
           <w:rFonts w:ascii="Arial" w:hAnsi="Arial"/>
           <w:sz w:val="20"/>
         </w:rPr>
-        <w:t>______________________________________________________________________________</w:t>
+        <w:t>_________________________________________________________________________</w:t>
       </w:r>
     </w:p>
     <w:p>
@@ -1013,6 +991,7 @@
           <w:b/>
           <w:sz w:val="24"/>
         </w:rPr>
+        <w:lastRenderedPageBreak/>
         <w:t>Próximo sprint</w:t>
       </w:r>
     </w:p>
@@ -1026,30 +1005,51 @@
       </w:r>
     </w:p>
     <w:sectPr>
-      <w:headerReference w:type="default" r:id="rId4"/>
-      <w:headerReference w:type="first" r:id="rId5"/>
-      <w:footerReference w:type="default" r:id="rId6"/>
-      <w:footerReference w:type="first" r:id="rId7"/>
-      <w:type w:val="nextPage"/>
-      <w:pgSz w:orient="landscape" w:w="15840" w:h="12240"/>
-      <w:pgMar w:left="1985" w:right="1418" w:gutter="0" w:header="709" w:top="1701" w:footer="709" w:bottom="1701"/>
-      <w:pgNumType w:fmt="decimal"/>
-      <w:formProt w:val="false"/>
-      <w:textDirection w:val="lrTb"/>
-      <w:docGrid w:type="default" w:linePitch="360" w:charSpace="0"/>
+      <w:headerReference w:type="default" r:id="rId7"/>
+      <w:footerReference w:type="default" r:id="rId8"/>
+      <w:headerReference w:type="first" r:id="rId9"/>
+      <w:footerReference w:type="first" r:id="rId10"/>
+      <w:pgSz w:w="15840" w:h="12240" w:orient="landscape"/>
+      <w:pgMar w:top="1701" w:right="1418" w:bottom="1701" w:left="1985" w:header="709" w:footer="709" w:gutter="0"/>
+      <w:cols w:space="720"/>
+      <w:formProt w:val="0"/>
+      <w:docGrid w:linePitch="360"/>
     </w:sectPr>
   </w:body>
 </w:document>
 </file>
 
+<file path=word/endnotes.xml><?xml version="1.0" encoding="utf-8"?>
+<w:endnotes xmlns:wpc="http://schemas.microsoft.com/office/word/2010/wordprocessingCanvas" xmlns:cx="http://schemas.microsoft.com/office/drawing/2014/chartex" xmlns:cx1="http://schemas.microsoft.com/office/drawing/2015/9/8/chartex" xmlns:cx2="http://schemas.microsoft.com/office/drawing/2015/10/21/chartex" xmlns:cx3="http://schemas.microsoft.com/office/drawing/2016/5/9/chartex" xmlns:cx4="http://schemas.microsoft.com/office/drawing/2016/5/10/chartex" xmlns:cx5="http://schemas.microsoft.com/office/drawing/2016/5/11/chartex" xmlns:cx6="http://schemas.microsoft.com/office/drawing/2016/5/12/chartex" xmlns:cx7="http://schemas.microsoft.com/office/drawing/2016/5/13/chartex" xmlns:cx8="http://schemas.microsoft.com/office/drawing/2016/5/14/chartex" xmlns:mc="http://schemas.openxmlformats.org/markup-compatibility/2006" xmlns:aink="http://schemas.microsoft.com/office/drawing/2016/ink" xmlns:am3d="http://schemas.microsoft.com/office/drawing/2017/model3d" xmlns:o="urn:schemas-microsoft-com:office:office" xmlns:r="http://schemas.openxmlformats.org/officeDocument/2006/relationships" xmlns:m="http://schemas.openxmlformats.org/officeDocument/2006/math" xmlns:v="urn:schemas-microsoft-com:vml" xmlns:wp14="http://schemas.microsoft.com/office/word/2010/wordprocessingDrawing" xmlns:wp="http://schemas.openxmlformats.org/drawingml/2006/wordprocessingDrawing" xmlns:w10="urn:schemas-microsoft-com:office:word" xmlns:w="http://schemas.openxmlformats.org/wordprocessingml/2006/main" xmlns:w14="http://schemas.microsoft.com/office/word/2010/wordml" xmlns:w15="http://schemas.microsoft.com/office/word/2012/wordml" xmlns:w16cex="http://schemas.microsoft.com/office/word/2018/wordml/cex" xmlns:w16cid="http://schemas.microsoft.com/office/word/2016/wordml/cid" xmlns:w16="http://schemas.microsoft.com/office/word/2018/wordml" xmlns:w16sdtdh="http://schemas.microsoft.com/office/word/2020/wordml/sdtdatahash" xmlns:w16se="http://schemas.microsoft.com/office/word/2015/wordml/symex" xmlns:wpg="http://schemas.microsoft.com/office/word/2010/wordprocessingGroup" xmlns:wpi="http://schemas.microsoft.com/office/word/2010/wordprocessingInk" xmlns:wne="http://schemas.microsoft.com/office/word/2006/wordml" xmlns:wps="http://schemas.microsoft.com/office/word/2010/wordprocessingShape" mc:Ignorable="w14 w15 w16se w16cid w16 w16cex w16sdtdh wp14">
+  <w:endnote w:type="separator" w:id="-1">
+    <w:p>
+      <w:pPr>
+        <w:spacing w:after="0" w:line="240" w:lineRule="auto"/>
+      </w:pPr>
+      <w:r>
+        <w:separator/>
+      </w:r>
+    </w:p>
+  </w:endnote>
+  <w:endnote w:type="continuationSeparator" w:id="0">
+    <w:p>
+      <w:pPr>
+        <w:spacing w:after="0" w:line="240" w:lineRule="auto"/>
+      </w:pPr>
+      <w:r>
+        <w:continuationSeparator/>
+      </w:r>
+    </w:p>
+  </w:endnote>
+</w:endnotes>
+</file>
+
 <file path=word/footer1.xml><?xml version="1.0" encoding="utf-8"?>
-<w:ftr xmlns:o="urn:schemas-microsoft-com:office:office" xmlns:r="http://schemas.openxmlformats.org/officeDocument/2006/relationships" xmlns:v="urn:schemas-microsoft-com:vml" xmlns:w="http://schemas.openxmlformats.org/wordprocessingml/2006/main" xmlns:w10="urn:schemas-microsoft-com:office:word" xmlns:wp="http://schemas.openxmlformats.org/drawingml/2006/wordprocessingDrawing" xmlns:wps="http://schemas.microsoft.com/office/word/2010/wordprocessingShape" xmlns:wpg="http://schemas.microsoft.com/office/word/2010/wordprocessingGroup" xmlns:mc="http://schemas.openxmlformats.org/markup-compatibility/2006" xmlns:wp14="http://schemas.microsoft.com/office/word/2010/wordprocessingDrawing" xmlns:w14="http://schemas.microsoft.com/office/word/2010/wordml" xmlns:w15="http://schemas.microsoft.com/office/word/2012/wordml" mc:Ignorable="w14 wp14 w15">
+<w:ftr xmlns:wpc="http://schemas.microsoft.com/office/word/2010/wordprocessingCanvas" xmlns:cx="http://schemas.microsoft.com/office/drawing/2014/chartex" xmlns:cx1="http://schemas.microsoft.com/office/drawing/2015/9/8/chartex" xmlns:cx2="http://schemas.microsoft.com/office/drawing/2015/10/21/chartex" xmlns:cx3="http://schemas.microsoft.com/office/drawing/2016/5/9/chartex" xmlns:cx4="http://schemas.microsoft.com/office/drawing/2016/5/10/chartex" xmlns:cx5="http://schemas.microsoft.com/office/drawing/2016/5/11/chartex" xmlns:cx6="http://schemas.microsoft.com/office/drawing/2016/5/12/chartex" xmlns:cx7="http://schemas.microsoft.com/office/drawing/2016/5/13/chartex" xmlns:cx8="http://schemas.microsoft.com/office/drawing/2016/5/14/chartex" xmlns:mc="http://schemas.openxmlformats.org/markup-compatibility/2006" xmlns:aink="http://schemas.microsoft.com/office/drawing/2016/ink" xmlns:am3d="http://schemas.microsoft.com/office/drawing/2017/model3d" xmlns:o="urn:schemas-microsoft-com:office:office" xmlns:r="http://schemas.openxmlformats.org/officeDocument/2006/relationships" xmlns:m="http://schemas.openxmlformats.org/officeDocument/2006/math" xmlns:v="urn:schemas-microsoft-com:vml" xmlns:wp14="http://schemas.microsoft.com/office/word/2010/wordprocessingDrawing" xmlns:wp="http://schemas.openxmlformats.org/drawingml/2006/wordprocessingDrawing" xmlns:w10="urn:schemas-microsoft-com:office:word" xmlns:w="http://schemas.openxmlformats.org/wordprocessingml/2006/main" xmlns:w14="http://schemas.microsoft.com/office/word/2010/wordml" xmlns:w15="http://schemas.microsoft.com/office/word/2012/wordml" xmlns:w16cex="http://schemas.microsoft.com/office/word/2018/wordml/cex" xmlns:w16cid="http://schemas.microsoft.com/office/word/2016/wordml/cid" xmlns:w16="http://schemas.microsoft.com/office/word/2018/wordml" xmlns:w16sdtdh="http://schemas.microsoft.com/office/word/2020/wordml/sdtdatahash" xmlns:w16se="http://schemas.microsoft.com/office/word/2015/wordml/symex" xmlns:wpg="http://schemas.microsoft.com/office/word/2010/wordprocessingGroup" xmlns:wpi="http://schemas.microsoft.com/office/word/2010/wordprocessingInk" xmlns:wne="http://schemas.microsoft.com/office/word/2006/wordml" xmlns:wps="http://schemas.microsoft.com/office/word/2010/wordprocessingShape" mc:Ignorable="w14 w15 w16se w16cid w16 w16cex w16sdtdh wp14">
   <w:p>
     <w:pPr>
-      <w:pStyle w:val="Footer"/>
-      <w:spacing w:before="0" w:after="200"/>
+      <w:pStyle w:val="Piedepgina"/>
       <w:jc w:val="center"/>
-      <w:rPr/>
     </w:pPr>
     <w:r>
       <w:rPr>
@@ -1063,37 +1063,42 @@
 </file>
 
 <file path=word/footer2.xml><?xml version="1.0" encoding="utf-8"?>
-<w:ftr xmlns:o="urn:schemas-microsoft-com:office:office" xmlns:r="http://schemas.openxmlformats.org/officeDocument/2006/relationships" xmlns:v="urn:schemas-microsoft-com:vml" xmlns:w="http://schemas.openxmlformats.org/wordprocessingml/2006/main" xmlns:w10="urn:schemas-microsoft-com:office:word" xmlns:wp="http://schemas.openxmlformats.org/drawingml/2006/wordprocessingDrawing" xmlns:wps="http://schemas.microsoft.com/office/word/2010/wordprocessingShape" xmlns:wpg="http://schemas.microsoft.com/office/word/2010/wordprocessingGroup" xmlns:mc="http://schemas.openxmlformats.org/markup-compatibility/2006" xmlns:wp14="http://schemas.microsoft.com/office/word/2010/wordprocessingDrawing" xmlns:w14="http://schemas.microsoft.com/office/word/2010/wordml" xmlns:w15="http://schemas.microsoft.com/office/word/2012/wordml" mc:Ignorable="w14 wp14 w15">
-  <w:p>
-    <w:pPr>
-      <w:pStyle w:val="Footer"/>
-      <w:spacing w:before="0" w:after="200"/>
-      <w:jc w:val="center"/>
-      <w:rPr/>
-    </w:pPr>
-    <w:r>
-      <w:rPr>
-        <w:sz w:val="20"/>
-        <w:szCs w:val="20"/>
-      </w:rPr>
-      <w:t>La Oficina de Proyectos de Informática (http://www.pmoinformatica.com)</w:t>
-    </w:r>
-  </w:p>
-</w:ftr>
-</file>
-
-<file path=word/footer3.xml><?xml version="1.0" encoding="utf-8"?>
-<w:ftr xmlns:o="urn:schemas-microsoft-com:office:office" xmlns:r="http://schemas.openxmlformats.org/officeDocument/2006/relationships" xmlns:v="urn:schemas-microsoft-com:vml" xmlns:w="http://schemas.openxmlformats.org/wordprocessingml/2006/main" xmlns:w10="urn:schemas-microsoft-com:office:word" xmlns:wp="http://schemas.openxmlformats.org/drawingml/2006/wordprocessingDrawing" xmlns:wps="http://schemas.microsoft.com/office/word/2010/wordprocessingShape" xmlns:wpg="http://schemas.microsoft.com/office/word/2010/wordprocessingGroup" xmlns:mc="http://schemas.openxmlformats.org/markup-compatibility/2006" xmlns:wp14="http://schemas.microsoft.com/office/word/2010/wordprocessingDrawing" xmlns:w14="http://schemas.microsoft.com/office/word/2010/wordml" xmlns:w15="http://schemas.microsoft.com/office/word/2012/wordml" mc:Ignorable="w14 wp14 w15">
+<w:ftr xmlns:wpc="http://schemas.microsoft.com/office/word/2010/wordprocessingCanvas" xmlns:cx="http://schemas.microsoft.com/office/drawing/2014/chartex" xmlns:cx1="http://schemas.microsoft.com/office/drawing/2015/9/8/chartex" xmlns:cx2="http://schemas.microsoft.com/office/drawing/2015/10/21/chartex" xmlns:cx3="http://schemas.microsoft.com/office/drawing/2016/5/9/chartex" xmlns:cx4="http://schemas.microsoft.com/office/drawing/2016/5/10/chartex" xmlns:cx5="http://schemas.microsoft.com/office/drawing/2016/5/11/chartex" xmlns:cx6="http://schemas.microsoft.com/office/drawing/2016/5/12/chartex" xmlns:cx7="http://schemas.microsoft.com/office/drawing/2016/5/13/chartex" xmlns:cx8="http://schemas.microsoft.com/office/drawing/2016/5/14/chartex" xmlns:mc="http://schemas.openxmlformats.org/markup-compatibility/2006" xmlns:aink="http://schemas.microsoft.com/office/drawing/2016/ink" xmlns:am3d="http://schemas.microsoft.com/office/drawing/2017/model3d" xmlns:o="urn:schemas-microsoft-com:office:office" xmlns:r="http://schemas.openxmlformats.org/officeDocument/2006/relationships" xmlns:m="http://schemas.openxmlformats.org/officeDocument/2006/math" xmlns:v="urn:schemas-microsoft-com:vml" xmlns:wp14="http://schemas.microsoft.com/office/word/2010/wordprocessingDrawing" xmlns:wp="http://schemas.openxmlformats.org/drawingml/2006/wordprocessingDrawing" xmlns:w10="urn:schemas-microsoft-com:office:word" xmlns:w="http://schemas.openxmlformats.org/wordprocessingml/2006/main" xmlns:w14="http://schemas.microsoft.com/office/word/2010/wordml" xmlns:w15="http://schemas.microsoft.com/office/word/2012/wordml" xmlns:w16cex="http://schemas.microsoft.com/office/word/2018/wordml/cex" xmlns:w16cid="http://schemas.microsoft.com/office/word/2016/wordml/cid" xmlns:w16="http://schemas.microsoft.com/office/word/2018/wordml" xmlns:w16sdtdh="http://schemas.microsoft.com/office/word/2020/wordml/sdtdatahash" xmlns:w16se="http://schemas.microsoft.com/office/word/2015/wordml/symex" xmlns:wpg="http://schemas.microsoft.com/office/word/2010/wordprocessingGroup" xmlns:wpi="http://schemas.microsoft.com/office/word/2010/wordprocessingInk" xmlns:wne="http://schemas.microsoft.com/office/word/2006/wordml" xmlns:wps="http://schemas.microsoft.com/office/word/2010/wordprocessingShape" mc:Ignorable="w14 w15 w16se w16cid w16 w16cex w16sdtdh wp14">
   <w:p/>
 </w:ftr>
 </file>
 
+<file path=word/footnotes.xml><?xml version="1.0" encoding="utf-8"?>
+<w:footnotes xmlns:wpc="http://schemas.microsoft.com/office/word/2010/wordprocessingCanvas" xmlns:cx="http://schemas.microsoft.com/office/drawing/2014/chartex" xmlns:cx1="http://schemas.microsoft.com/office/drawing/2015/9/8/chartex" xmlns:cx2="http://schemas.microsoft.com/office/drawing/2015/10/21/chartex" xmlns:cx3="http://schemas.microsoft.com/office/drawing/2016/5/9/chartex" xmlns:cx4="http://schemas.microsoft.com/office/drawing/2016/5/10/chartex" xmlns:cx5="http://schemas.microsoft.com/office/drawing/2016/5/11/chartex" xmlns:cx6="http://schemas.microsoft.com/office/drawing/2016/5/12/chartex" xmlns:cx7="http://schemas.microsoft.com/office/drawing/2016/5/13/chartex" xmlns:cx8="http://schemas.microsoft.com/office/drawing/2016/5/14/chartex" xmlns:mc="http://schemas.openxmlformats.org/markup-compatibility/2006" xmlns:aink="http://schemas.microsoft.com/office/drawing/2016/ink" xmlns:am3d="http://schemas.microsoft.com/office/drawing/2017/model3d" xmlns:o="urn:schemas-microsoft-com:office:office" xmlns:r="http://schemas.openxmlformats.org/officeDocument/2006/relationships" xmlns:m="http://schemas.openxmlformats.org/officeDocument/2006/math" xmlns:v="urn:schemas-microsoft-com:vml" xmlns:wp14="http://schemas.microsoft.com/office/word/2010/wordprocessingDrawing" xmlns:wp="http://schemas.openxmlformats.org/drawingml/2006/wordprocessingDrawing" xmlns:w10="urn:schemas-microsoft-com:office:word" xmlns:w="http://schemas.openxmlformats.org/wordprocessingml/2006/main" xmlns:w14="http://schemas.microsoft.com/office/word/2010/wordml" xmlns:w15="http://schemas.microsoft.com/office/word/2012/wordml" xmlns:w16cex="http://schemas.microsoft.com/office/word/2018/wordml/cex" xmlns:w16cid="http://schemas.microsoft.com/office/word/2016/wordml/cid" xmlns:w16="http://schemas.microsoft.com/office/word/2018/wordml" xmlns:w16sdtdh="http://schemas.microsoft.com/office/word/2020/wordml/sdtdatahash" xmlns:w16se="http://schemas.microsoft.com/office/word/2015/wordml/symex" xmlns:wpg="http://schemas.microsoft.com/office/word/2010/wordprocessingGroup" xmlns:wpi="http://schemas.microsoft.com/office/word/2010/wordprocessingInk" xmlns:wne="http://schemas.microsoft.com/office/word/2006/wordml" xmlns:wps="http://schemas.microsoft.com/office/word/2010/wordprocessingShape" mc:Ignorable="w14 w15 w16se w16cid w16 w16cex w16sdtdh wp14">
+  <w:footnote w:type="separator" w:id="-1">
+    <w:p>
+      <w:pPr>
+        <w:spacing w:after="0" w:line="240" w:lineRule="auto"/>
+      </w:pPr>
+      <w:r>
+        <w:separator/>
+      </w:r>
+    </w:p>
+  </w:footnote>
+  <w:footnote w:type="continuationSeparator" w:id="0">
+    <w:p>
+      <w:pPr>
+        <w:spacing w:after="0" w:line="240" w:lineRule="auto"/>
+      </w:pPr>
+      <w:r>
+        <w:continuationSeparator/>
+      </w:r>
+    </w:p>
+  </w:footnote>
+</w:footnotes>
+</file>
+
 <file path=word/header1.xml><?xml version="1.0" encoding="utf-8"?>
-<w:hdr xmlns:o="urn:schemas-microsoft-com:office:office" xmlns:r="http://schemas.openxmlformats.org/officeDocument/2006/relationships" xmlns:v="urn:schemas-microsoft-com:vml" xmlns:w="http://schemas.openxmlformats.org/wordprocessingml/2006/main" xmlns:w10="urn:schemas-microsoft-com:office:word" xmlns:wp="http://schemas.openxmlformats.org/drawingml/2006/wordprocessingDrawing" xmlns:wps="http://schemas.microsoft.com/office/word/2010/wordprocessingShape" xmlns:wpg="http://schemas.microsoft.com/office/word/2010/wordprocessingGroup" xmlns:mc="http://schemas.openxmlformats.org/markup-compatibility/2006" xmlns:wp14="http://schemas.microsoft.com/office/word/2010/wordprocessingDrawing" xmlns:w14="http://schemas.microsoft.com/office/word/2010/wordml" xmlns:w15="http://schemas.microsoft.com/office/word/2012/wordml" mc:Ignorable="w14 wp14 w15">
+<w:hdr xmlns:wpc="http://schemas.microsoft.com/office/word/2010/wordprocessingCanvas" xmlns:cx="http://schemas.microsoft.com/office/drawing/2014/chartex" xmlns:cx1="http://schemas.microsoft.com/office/drawing/2015/9/8/chartex" xmlns:cx2="http://schemas.microsoft.com/office/drawing/2015/10/21/chartex" xmlns:cx3="http://schemas.microsoft.com/office/drawing/2016/5/9/chartex" xmlns:cx4="http://schemas.microsoft.com/office/drawing/2016/5/10/chartex" xmlns:cx5="http://schemas.microsoft.com/office/drawing/2016/5/11/chartex" xmlns:cx6="http://schemas.microsoft.com/office/drawing/2016/5/12/chartex" xmlns:cx7="http://schemas.microsoft.com/office/drawing/2016/5/13/chartex" xmlns:cx8="http://schemas.microsoft.com/office/drawing/2016/5/14/chartex" xmlns:mc="http://schemas.openxmlformats.org/markup-compatibility/2006" xmlns:aink="http://schemas.microsoft.com/office/drawing/2016/ink" xmlns:am3d="http://schemas.microsoft.com/office/drawing/2017/model3d" xmlns:o="urn:schemas-microsoft-com:office:office" xmlns:r="http://schemas.openxmlformats.org/officeDocument/2006/relationships" xmlns:m="http://schemas.openxmlformats.org/officeDocument/2006/math" xmlns:v="urn:schemas-microsoft-com:vml" xmlns:wp14="http://schemas.microsoft.com/office/word/2010/wordprocessingDrawing" xmlns:wp="http://schemas.openxmlformats.org/drawingml/2006/wordprocessingDrawing" xmlns:w10="urn:schemas-microsoft-com:office:word" xmlns:w="http://schemas.openxmlformats.org/wordprocessingml/2006/main" xmlns:w14="http://schemas.microsoft.com/office/word/2010/wordml" xmlns:w15="http://schemas.microsoft.com/office/word/2012/wordml" xmlns:w16cex="http://schemas.microsoft.com/office/word/2018/wordml/cex" xmlns:w16cid="http://schemas.microsoft.com/office/word/2016/wordml/cid" xmlns:w16="http://schemas.microsoft.com/office/word/2018/wordml" xmlns:w16sdtdh="http://schemas.microsoft.com/office/word/2020/wordml/sdtdatahash" xmlns:w16se="http://schemas.microsoft.com/office/word/2015/wordml/symex" xmlns:wpg="http://schemas.microsoft.com/office/word/2010/wordprocessingGroup" xmlns:wpi="http://schemas.microsoft.com/office/word/2010/wordprocessingInk" xmlns:wne="http://schemas.microsoft.com/office/word/2006/wordml" xmlns:wps="http://schemas.microsoft.com/office/word/2010/wordprocessingShape" mc:Ignorable="w14 w15 w16se w16cid w16 w16cex w16sdtdh wp14">
   <w:p>
     <w:pPr>
-      <w:pStyle w:val="Header"/>
-      <w:spacing w:before="0" w:after="0"/>
+      <w:pStyle w:val="Encabezado"/>
+      <w:spacing w:after="0"/>
       <w:rPr>
         <w:b/>
         <w:color w:val="0D0D0D"/>
@@ -1108,17 +1113,25 @@
         <w:sz w:val="28"/>
         <w:szCs w:val="28"/>
       </w:rPr>
-      <w:t>La Oficina de Proyectos de Informática</w:t>
+      <w:t xml:space="preserve">La </w:t>
+    </w:r>
+    <w:r>
+      <w:rPr>
+        <w:b/>
+        <w:color w:val="0D0D0D"/>
+        <w:sz w:val="28"/>
+        <w:szCs w:val="28"/>
+      </w:rPr>
+      <w:t>Oficina de Proyectos de Informática</w:t>
     </w:r>
   </w:p>
   <w:p>
     <w:pPr>
-      <w:pStyle w:val="Header"/>
-      <w:spacing w:before="0" w:after="0"/>
-      <w:jc w:val="end"/>
+      <w:pStyle w:val="Encabezado"/>
+      <w:spacing w:after="0"/>
+      <w:jc w:val="right"/>
       <w:rPr>
         <w:b/>
-        <w:i/>
         <w:i/>
         <w:color w:val="365F91"/>
         <w:sz w:val="24"/>
@@ -1126,74 +1139,14 @@
       </w:rPr>
     </w:pPr>
     <w:r>
-      <mc:AlternateContent>
-        <mc:Choice Requires="wps">
-          <w:drawing>
-            <wp:anchor behindDoc="1" distT="0" distB="0" distL="114935" distR="114935" simplePos="0" locked="0" layoutInCell="1" allowOverlap="1" relativeHeight="2">
-              <wp:simplePos x="0" y="0"/>
-              <wp:positionH relativeFrom="column">
-                <wp:posOffset>-2540</wp:posOffset>
-              </wp:positionH>
-              <wp:positionV relativeFrom="paragraph">
-                <wp:posOffset>196215</wp:posOffset>
-              </wp:positionV>
-              <wp:extent cx="5612765" cy="162560"/>
-              <wp:effectExtent l="19685" t="19050" r="31115" b="41275"/>
-              <wp:wrapNone/>
-              <wp:docPr id="1" name=""/>
-              <a:graphic xmlns:a="http://schemas.openxmlformats.org/drawingml/2006/main">
-                <a:graphicData uri="http://schemas.microsoft.com/office/word/2010/wordprocessingShape">
-                  <wps:wsp>
-                    <wps:cNvSpPr/>
-                    <wps:spPr>
-                      <a:xfrm>
-                        <a:off x="0" y="0"/>
-                        <a:ext cx="5612760" cy="162720"/>
-                      </a:xfrm>
-                      <a:prstGeom prst="rect">
-                        <a:avLst/>
-                      </a:prstGeom>
-                      <a:solidFill>
-                        <a:srgbClr val="4f81bd"/>
-                      </a:solidFill>
-                      <a:ln w="38160">
-                        <a:solidFill>
-                          <a:srgbClr val="f2f2f2"/>
-                        </a:solidFill>
-                        <a:miter/>
-                      </a:ln>
-                      <a:effectLst>
-                        <a:outerShdw dist="25630" dir="3633274" blurRad="0" rotWithShape="0">
-                          <a:srgbClr val="243f60">
-                            <a:alpha val="50000"/>
-                          </a:srgbClr>
-                        </a:outerShdw>
-                      </a:effectLst>
-                    </wps:spPr>
-                    <wps:style>
-                      <a:lnRef idx="0"/>
-                      <a:fillRef idx="0"/>
-                      <a:effectRef idx="0"/>
-                      <a:fontRef idx="minor"/>
-                    </wps:style>
-                    <wps:bodyPr/>
-                  </wps:wsp>
-                </a:graphicData>
-              </a:graphic>
-            </wp:anchor>
-          </w:drawing>
-        </mc:Choice>
-        <mc:Fallback>
-          <w:pict>
-            <v:rect id="shape_0" fillcolor="#4f81bd" stroked="t" o:allowincell="f" style="position:absolute;margin-left:-0.2pt;margin-top:15.45pt;width:441.9pt;height:12.75pt;mso-wrap-style:none;v-text-anchor:middle">
-              <v:fill o:detectmouseclick="t" type="solid" color2="#b07e42"/>
-              <v:stroke color="#f2f2f2" weight="38160" joinstyle="miter" endcap="flat"/>
-              <v:shadow on="t" obscured="f" color="#243f60"/>
-              <w10:wrap type="none"/>
-            </v:rect>
-          </w:pict>
-        </mc:Fallback>
-      </mc:AlternateContent>
+      <w:rPr>
+        <w:noProof/>
+      </w:rPr>
+      <w:pict w14:anchorId="2554946C">
+        <v:rect id="_x0000_s2049" style="position:absolute;left:0;text-align:left;margin-left:-.2pt;margin-top:15.45pt;width:620.35pt;height:12.8pt;z-index:-1;visibility:visible;mso-wrap-style:square;mso-wrap-distance-left:9.05pt;mso-wrap-distance-top:0;mso-wrap-distance-right:9.05pt;mso-wrap-distance-bottom:0;mso-position-horizontal:absolute;mso-position-horizontal-relative:text;mso-position-vertical:absolute;mso-position-vertical-relative:text;v-text-anchor:top" o:gfxdata="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" fillcolor="#4f81bd" strokecolor="#f2f2f2" strokeweight="1.06mm">
+          <v:shadow on="t" color="#243f60" opacity=".5" origin=",.5" offset=".35mm,.61997mm"/>
+        </v:rect>
+      </w:pict>
     </w:r>
     <w:r>
       <w:rPr>
@@ -1208,19 +1161,9 @@
   </w:p>
   <w:p>
     <w:pPr>
-      <w:pStyle w:val="Header"/>
-      <w:spacing w:before="0" w:after="0"/>
-      <w:jc w:val="end"/>
-      <w:rPr>
-        <w:b/>
-        <w:i/>
-        <w:i/>
-        <w:color w:val="365F91"/>
-        <w:sz w:val="24"/>
-        <w:szCs w:val="24"/>
-      </w:rPr>
-    </w:pPr>
-    <w:r>
+      <w:pStyle w:val="Encabezado"/>
+      <w:spacing w:after="0"/>
+      <w:jc w:val="right"/>
       <w:rPr>
         <w:b/>
         <w:i/>
@@ -1228,205 +1171,63 @@
         <w:sz w:val="24"/>
         <w:szCs w:val="24"/>
       </w:rPr>
-    </w:r>
+    </w:pPr>
   </w:p>
 </w:hdr>
 </file>
 
 <file path=word/header2.xml><?xml version="1.0" encoding="utf-8"?>
-<w:hdr xmlns:o="urn:schemas-microsoft-com:office:office" xmlns:r="http://schemas.openxmlformats.org/officeDocument/2006/relationships" xmlns:v="urn:schemas-microsoft-com:vml" xmlns:w="http://schemas.openxmlformats.org/wordprocessingml/2006/main" xmlns:w10="urn:schemas-microsoft-com:office:word" xmlns:wp="http://schemas.openxmlformats.org/drawingml/2006/wordprocessingDrawing" xmlns:wps="http://schemas.microsoft.com/office/word/2010/wordprocessingShape" xmlns:wpg="http://schemas.microsoft.com/office/word/2010/wordprocessingGroup" xmlns:mc="http://schemas.openxmlformats.org/markup-compatibility/2006" xmlns:wp14="http://schemas.microsoft.com/office/word/2010/wordprocessingDrawing" xmlns:w14="http://schemas.microsoft.com/office/word/2010/wordml" xmlns:w15="http://schemas.microsoft.com/office/word/2012/wordml" mc:Ignorable="w14 wp14 w15">
-  <w:p>
-    <w:pPr>
-      <w:pStyle w:val="Header"/>
-      <w:spacing w:before="0" w:after="0"/>
-      <w:rPr>
-        <w:b/>
-        <w:color w:val="0D0D0D"/>
-        <w:sz w:val="28"/>
-        <w:szCs w:val="28"/>
-      </w:rPr>
-    </w:pPr>
-    <w:r>
-      <w:rPr>
-        <w:b/>
-        <w:color w:val="0D0D0D"/>
-        <w:sz w:val="28"/>
-        <w:szCs w:val="28"/>
-      </w:rPr>
-      <w:t>La Oficina de Proyectos de Informática</w:t>
-    </w:r>
-  </w:p>
-  <w:p>
-    <w:pPr>
-      <w:pStyle w:val="Header"/>
-      <w:spacing w:before="0" w:after="0"/>
-      <w:jc w:val="end"/>
-      <w:rPr>
-        <w:b/>
-        <w:i/>
-        <w:i/>
-        <w:color w:val="365F91"/>
-        <w:sz w:val="24"/>
-        <w:szCs w:val="24"/>
-      </w:rPr>
-    </w:pPr>
-    <w:r>
-      <mc:AlternateContent>
-        <mc:Choice Requires="wps">
-          <w:drawing>
-            <wp:anchor behindDoc="1" distT="0" distB="0" distL="114935" distR="114935" simplePos="0" locked="0" layoutInCell="1" allowOverlap="1" relativeHeight="3">
-              <wp:simplePos x="0" y="0"/>
-              <wp:positionH relativeFrom="column">
-                <wp:posOffset>-2540</wp:posOffset>
-              </wp:positionH>
-              <wp:positionV relativeFrom="paragraph">
-                <wp:posOffset>196215</wp:posOffset>
-              </wp:positionV>
-              <wp:extent cx="7878445" cy="162560"/>
-              <wp:effectExtent l="19685" t="19050" r="31115" b="41275"/>
-              <wp:wrapNone/>
-              <wp:docPr id="2" name=""/>
-              <a:graphic xmlns:a="http://schemas.openxmlformats.org/drawingml/2006/main">
-                <a:graphicData uri="http://schemas.microsoft.com/office/word/2010/wordprocessingShape">
-                  <wps:wsp>
-                    <wps:cNvSpPr/>
-                    <wps:spPr>
-                      <a:xfrm>
-                        <a:off x="0" y="0"/>
-                        <a:ext cx="7878600" cy="162720"/>
-                      </a:xfrm>
-                      <a:prstGeom prst="rect">
-                        <a:avLst/>
-                      </a:prstGeom>
-                      <a:solidFill>
-                        <a:srgbClr val="4f81bd"/>
-                      </a:solidFill>
-                      <a:ln w="38160">
-                        <a:solidFill>
-                          <a:srgbClr val="f2f2f2"/>
-                        </a:solidFill>
-                        <a:miter/>
-                      </a:ln>
-                      <a:effectLst>
-                        <a:outerShdw dist="25630" dir="3633274" blurRad="0" rotWithShape="0">
-                          <a:srgbClr val="243f60">
-                            <a:alpha val="50000"/>
-                          </a:srgbClr>
-                        </a:outerShdw>
-                      </a:effectLst>
-                    </wps:spPr>
-                    <wps:style>
-                      <a:lnRef idx="0"/>
-                      <a:fillRef idx="0"/>
-                      <a:effectRef idx="0"/>
-                      <a:fontRef idx="minor"/>
-                    </wps:style>
-                    <wps:bodyPr/>
-                  </wps:wsp>
-                </a:graphicData>
-              </a:graphic>
-            </wp:anchor>
-          </w:drawing>
-        </mc:Choice>
-        <mc:Fallback>
-          <w:pict>
-            <v:rect id="shape_0" fillcolor="#4f81bd" stroked="t" o:allowincell="f" style="position:absolute;margin-left:-0.2pt;margin-top:15.45pt;width:620.3pt;height:12.75pt;mso-wrap-style:none;v-text-anchor:middle">
-              <v:fill o:detectmouseclick="t" type="solid" color2="#b07e42"/>
-              <v:stroke color="#f2f2f2" weight="38160" joinstyle="miter" endcap="flat"/>
-              <v:shadow on="t" obscured="f" color="#243f60"/>
-              <w10:wrap type="none"/>
-            </v:rect>
-          </w:pict>
-        </mc:Fallback>
-      </mc:AlternateContent>
-    </w:r>
-    <w:r>
-      <w:rPr>
-        <w:b/>
-        <w:i/>
-        <w:color w:val="365F91"/>
-        <w:sz w:val="24"/>
-        <w:szCs w:val="24"/>
-      </w:rPr>
-      <w:t>www.pmoinformatica.com</w:t>
-    </w:r>
-  </w:p>
-  <w:p>
-    <w:pPr>
-      <w:pStyle w:val="Header"/>
-      <w:spacing w:before="0" w:after="0"/>
-      <w:jc w:val="end"/>
-      <w:rPr>
-        <w:b/>
-        <w:i/>
-        <w:i/>
-        <w:color w:val="365F91"/>
-        <w:sz w:val="24"/>
-        <w:szCs w:val="24"/>
-      </w:rPr>
-    </w:pPr>
-    <w:r>
-      <w:rPr>
-        <w:b/>
-        <w:i/>
-        <w:color w:val="365F91"/>
-        <w:sz w:val="24"/>
-        <w:szCs w:val="24"/>
-      </w:rPr>
-    </w:r>
-  </w:p>
-</w:hdr>
-</file>
-
-<file path=word/header3.xml><?xml version="1.0" encoding="utf-8"?>
-<w:hdr xmlns:o="urn:schemas-microsoft-com:office:office" xmlns:r="http://schemas.openxmlformats.org/officeDocument/2006/relationships" xmlns:v="urn:schemas-microsoft-com:vml" xmlns:w="http://schemas.openxmlformats.org/wordprocessingml/2006/main" xmlns:w10="urn:schemas-microsoft-com:office:word" xmlns:wp="http://schemas.openxmlformats.org/drawingml/2006/wordprocessingDrawing" xmlns:wps="http://schemas.microsoft.com/office/word/2010/wordprocessingShape" xmlns:wpg="http://schemas.microsoft.com/office/word/2010/wordprocessingGroup" xmlns:mc="http://schemas.openxmlformats.org/markup-compatibility/2006" xmlns:wp14="http://schemas.microsoft.com/office/word/2010/wordprocessingDrawing" xmlns:w14="http://schemas.microsoft.com/office/word/2010/wordml" xmlns:w15="http://schemas.microsoft.com/office/word/2012/wordml" mc:Ignorable="w14 wp14 w15">
+<w:hdr xmlns:wpc="http://schemas.microsoft.com/office/word/2010/wordprocessingCanvas" xmlns:cx="http://schemas.microsoft.com/office/drawing/2014/chartex" xmlns:cx1="http://schemas.microsoft.com/office/drawing/2015/9/8/chartex" xmlns:cx2="http://schemas.microsoft.com/office/drawing/2015/10/21/chartex" xmlns:cx3="http://schemas.microsoft.com/office/drawing/2016/5/9/chartex" xmlns:cx4="http://schemas.microsoft.com/office/drawing/2016/5/10/chartex" xmlns:cx5="http://schemas.microsoft.com/office/drawing/2016/5/11/chartex" xmlns:cx6="http://schemas.microsoft.com/office/drawing/2016/5/12/chartex" xmlns:cx7="http://schemas.microsoft.com/office/drawing/2016/5/13/chartex" xmlns:cx8="http://schemas.microsoft.com/office/drawing/2016/5/14/chartex" xmlns:mc="http://schemas.openxmlformats.org/markup-compatibility/2006" xmlns:aink="http://schemas.microsoft.com/office/drawing/2016/ink" xmlns:am3d="http://schemas.microsoft.com/office/drawing/2017/model3d" xmlns:o="urn:schemas-microsoft-com:office:office" xmlns:r="http://schemas.openxmlformats.org/officeDocument/2006/relationships" xmlns:m="http://schemas.openxmlformats.org/officeDocument/2006/math" xmlns:v="urn:schemas-microsoft-com:vml" xmlns:wp14="http://schemas.microsoft.com/office/word/2010/wordprocessingDrawing" xmlns:wp="http://schemas.openxmlformats.org/drawingml/2006/wordprocessingDrawing" xmlns:w10="urn:schemas-microsoft-com:office:word" xmlns:w="http://schemas.openxmlformats.org/wordprocessingml/2006/main" xmlns:w14="http://schemas.microsoft.com/office/word/2010/wordml" xmlns:w15="http://schemas.microsoft.com/office/word/2012/wordml" xmlns:w16cex="http://schemas.microsoft.com/office/word/2018/wordml/cex" xmlns:w16cid="http://schemas.microsoft.com/office/word/2016/wordml/cid" xmlns:w16="http://schemas.microsoft.com/office/word/2018/wordml" xmlns:w16sdtdh="http://schemas.microsoft.com/office/word/2020/wordml/sdtdatahash" xmlns:w16se="http://schemas.microsoft.com/office/word/2015/wordml/symex" xmlns:wpg="http://schemas.microsoft.com/office/word/2010/wordprocessingGroup" xmlns:wpi="http://schemas.microsoft.com/office/word/2010/wordprocessingInk" xmlns:wne="http://schemas.microsoft.com/office/word/2006/wordml" xmlns:wps="http://schemas.microsoft.com/office/word/2010/wordprocessingShape" mc:Ignorable="w14 w15 w16se w16cid w16 w16cex w16sdtdh wp14">
   <w:p/>
 </w:hdr>
 </file>
 
 <file path=word/numbering.xml><?xml version="1.0" encoding="utf-8"?>
-<w:numbering xmlns:w="http://schemas.openxmlformats.org/wordprocessingml/2006/main" xmlns:o="urn:schemas-microsoft-com:office:office" xmlns:r="http://schemas.openxmlformats.org/officeDocument/2006/relationships" xmlns:v="urn:schemas-microsoft-com:vml" xmlns:mc="http://schemas.openxmlformats.org/markup-compatibility/2006" xmlns:w14="http://schemas.microsoft.com/office/word/2010/wordml" mc:Ignorable="w14">
-  <w:abstractNum w:abstractNumId="1">
+<w:numbering xmlns:wpc="http://schemas.microsoft.com/office/word/2010/wordprocessingCanvas" xmlns:cx="http://schemas.microsoft.com/office/drawing/2014/chartex" xmlns:cx1="http://schemas.microsoft.com/office/drawing/2015/9/8/chartex" xmlns:cx2="http://schemas.microsoft.com/office/drawing/2015/10/21/chartex" xmlns:cx3="http://schemas.microsoft.com/office/drawing/2016/5/9/chartex" xmlns:cx4="http://schemas.microsoft.com/office/drawing/2016/5/10/chartex" xmlns:cx5="http://schemas.microsoft.com/office/drawing/2016/5/11/chartex" xmlns:cx6="http://schemas.microsoft.com/office/drawing/2016/5/12/chartex" xmlns:cx7="http://schemas.microsoft.com/office/drawing/2016/5/13/chartex" xmlns:cx8="http://schemas.microsoft.com/office/drawing/2016/5/14/chartex" xmlns:mc="http://schemas.openxmlformats.org/markup-compatibility/2006" xmlns:aink="http://schemas.microsoft.com/office/drawing/2016/ink" xmlns:am3d="http://schemas.microsoft.com/office/drawing/2017/model3d" xmlns:o="urn:schemas-microsoft-com:office:office" xmlns:r="http://schemas.openxmlformats.org/officeDocument/2006/relationships" xmlns:m="http://schemas.openxmlformats.org/officeDocument/2006/math" xmlns:v="urn:schemas-microsoft-com:vml" xmlns:wp14="http://schemas.microsoft.com/office/word/2010/wordprocessingDrawing" xmlns:wp="http://schemas.openxmlformats.org/drawingml/2006/wordprocessingDrawing" xmlns:w10="urn:schemas-microsoft-com:office:word" xmlns:w="http://schemas.openxmlformats.org/wordprocessingml/2006/main" xmlns:w14="http://schemas.microsoft.com/office/word/2010/wordml" xmlns:w15="http://schemas.microsoft.com/office/word/2012/wordml" xmlns:w16cex="http://schemas.microsoft.com/office/word/2018/wordml/cex" xmlns:w16cid="http://schemas.microsoft.com/office/word/2016/wordml/cid" xmlns:w16="http://schemas.microsoft.com/office/word/2018/wordml" xmlns:w16sdtdh="http://schemas.microsoft.com/office/word/2020/wordml/sdtdatahash" xmlns:w16se="http://schemas.microsoft.com/office/word/2015/wordml/symex" xmlns:wpg="http://schemas.microsoft.com/office/word/2010/wordprocessingGroup" xmlns:wpi="http://schemas.microsoft.com/office/word/2010/wordprocessingInk" xmlns:wne="http://schemas.microsoft.com/office/word/2006/wordml" xmlns:wps="http://schemas.microsoft.com/office/word/2010/wordprocessingShape" mc:Ignorable="w14 w15 w16se w16cid w16 w16cex w16sdtdh wp14">
+  <w:abstractNum w:abstractNumId="0" w15:restartNumberingAfterBreak="0">
+    <w:nsid w:val="2F190854"/>
+    <w:multiLevelType w:val="multilevel"/>
+    <w:tmpl w:val="633A401A"/>
     <w:lvl w:ilvl="0">
       <w:start w:val="1"/>
-      <w:pStyle w:val="Heading1"/>
       <w:numFmt w:val="none"/>
+      <w:pStyle w:val="Ttulo1"/>
       <w:suff w:val="nothing"/>
       <w:lvlText w:val=""/>
-      <w:lvlJc w:val="start"/>
+      <w:lvlJc w:val="left"/>
       <w:pPr>
         <w:tabs>
           <w:tab w:val="num" w:pos="0"/>
         </w:tabs>
-        <w:ind w:start="0" w:hanging="0"/>
+        <w:ind w:left="0" w:firstLine="0"/>
       </w:pPr>
     </w:lvl>
     <w:lvl w:ilvl="1">
       <w:start w:val="1"/>
-      <w:pStyle w:val="Heading2"/>
       <w:numFmt w:val="none"/>
+      <w:pStyle w:val="Ttulo2"/>
       <w:suff w:val="nothing"/>
       <w:lvlText w:val=""/>
-      <w:lvlJc w:val="start"/>
+      <w:lvlJc w:val="left"/>
       <w:pPr>
         <w:tabs>
           <w:tab w:val="num" w:pos="0"/>
         </w:tabs>
-        <w:ind w:start="0" w:hanging="0"/>
+        <w:ind w:left="0" w:firstLine="0"/>
       </w:pPr>
     </w:lvl>
     <w:lvl w:ilvl="2">
       <w:start w:val="1"/>
-      <w:pStyle w:val="Heading3"/>
       <w:numFmt w:val="none"/>
+      <w:pStyle w:val="Ttulo3"/>
       <w:suff w:val="nothing"/>
       <w:lvlText w:val=""/>
-      <w:lvlJc w:val="start"/>
+      <w:lvlJc w:val="left"/>
       <w:pPr>
         <w:tabs>
           <w:tab w:val="num" w:pos="0"/>
         </w:tabs>
-        <w:ind w:start="0" w:hanging="0"/>
+        <w:ind w:left="0" w:firstLine="0"/>
       </w:pPr>
     </w:lvl>
     <w:lvl w:ilvl="3">
@@ -1434,12 +1235,12 @@
       <w:numFmt w:val="none"/>
       <w:suff w:val="nothing"/>
       <w:lvlText w:val=""/>
-      <w:lvlJc w:val="start"/>
+      <w:lvlJc w:val="left"/>
       <w:pPr>
         <w:tabs>
           <w:tab w:val="num" w:pos="0"/>
         </w:tabs>
-        <w:ind w:start="0" w:hanging="0"/>
+        <w:ind w:left="0" w:firstLine="0"/>
       </w:pPr>
     </w:lvl>
     <w:lvl w:ilvl="4">
@@ -1447,12 +1248,12 @@
       <w:numFmt w:val="none"/>
       <w:suff w:val="nothing"/>
       <w:lvlText w:val=""/>
-      <w:lvlJc w:val="start"/>
+      <w:lvlJc w:val="left"/>
       <w:pPr>
         <w:tabs>
           <w:tab w:val="num" w:pos="0"/>
         </w:tabs>
-        <w:ind w:start="0" w:hanging="0"/>
+        <w:ind w:left="0" w:firstLine="0"/>
       </w:pPr>
     </w:lvl>
     <w:lvl w:ilvl="5">
@@ -1460,12 +1261,12 @@
       <w:numFmt w:val="none"/>
       <w:suff w:val="nothing"/>
       <w:lvlText w:val=""/>
-      <w:lvlJc w:val="start"/>
+      <w:lvlJc w:val="left"/>
       <w:pPr>
         <w:tabs>
           <w:tab w:val="num" w:pos="0"/>
         </w:tabs>
-        <w:ind w:start="0" w:hanging="0"/>
+        <w:ind w:left="0" w:firstLine="0"/>
       </w:pPr>
     </w:lvl>
     <w:lvl w:ilvl="6">
@@ -1473,12 +1274,12 @@
       <w:numFmt w:val="none"/>
       <w:suff w:val="nothing"/>
       <w:lvlText w:val=""/>
-      <w:lvlJc w:val="start"/>
+      <w:lvlJc w:val="left"/>
       <w:pPr>
         <w:tabs>
           <w:tab w:val="num" w:pos="0"/>
         </w:tabs>
-        <w:ind w:start="0" w:hanging="0"/>
+        <w:ind w:left="0" w:firstLine="0"/>
       </w:pPr>
     </w:lvl>
     <w:lvl w:ilvl="7">
@@ -1486,12 +1287,12 @@
       <w:numFmt w:val="none"/>
       <w:suff w:val="nothing"/>
       <w:lvlText w:val=""/>
-      <w:lvlJc w:val="start"/>
+      <w:lvlJc w:val="left"/>
       <w:pPr>
         <w:tabs>
           <w:tab w:val="num" w:pos="0"/>
         </w:tabs>
-        <w:ind w:start="0" w:hanging="0"/>
+        <w:ind w:left="0" w:firstLine="0"/>
       </w:pPr>
     </w:lvl>
     <w:lvl w:ilvl="8">
@@ -1499,89 +1300,502 @@
       <w:numFmt w:val="none"/>
       <w:suff w:val="nothing"/>
       <w:lvlText w:val=""/>
-      <w:lvlJc w:val="start"/>
+      <w:lvlJc w:val="left"/>
       <w:pPr>
         <w:tabs>
           <w:tab w:val="num" w:pos="0"/>
         </w:tabs>
-        <w:ind w:start="0" w:hanging="0"/>
+        <w:ind w:left="0" w:firstLine="0"/>
       </w:pPr>
     </w:lvl>
   </w:abstractNum>
-  <w:abstractNum w:abstractNumId="2">
+  <w:abstractNum w:abstractNumId="1" w15:restartNumberingAfterBreak="0">
+    <w:nsid w:val="3E5E6C83"/>
+    <w:multiLevelType w:val="multilevel"/>
+    <w:tmpl w:val="4C468D6C"/>
     <w:lvl w:ilvl="0">
       <w:start w:val="1"/>
       <w:numFmt w:val="bullet"/>
       <w:lvlText w:val=""/>
-      <w:lvlJc w:val="start"/>
+      <w:lvlJc w:val="left"/>
       <w:pPr>
         <w:tabs>
           <w:tab w:val="num" w:pos="0"/>
         </w:tabs>
-        <w:ind w:start="720" w:hanging="360"/>
+        <w:ind w:left="720" w:hanging="360"/>
       </w:pPr>
       <w:rPr>
         <w:rFonts w:ascii="Symbol" w:hAnsi="Symbol" w:cs="Symbol" w:hint="default"/>
       </w:rPr>
     </w:lvl>
+    <w:lvl w:ilvl="1">
+      <w:numFmt w:val="decimal"/>
+      <w:lvlText w:val=""/>
+      <w:lvlJc w:val="left"/>
+    </w:lvl>
+    <w:lvl w:ilvl="2">
+      <w:numFmt w:val="decimal"/>
+      <w:lvlText w:val=""/>
+      <w:lvlJc w:val="left"/>
+    </w:lvl>
+    <w:lvl w:ilvl="3">
+      <w:numFmt w:val="decimal"/>
+      <w:lvlText w:val=""/>
+      <w:lvlJc w:val="left"/>
+    </w:lvl>
+    <w:lvl w:ilvl="4">
+      <w:numFmt w:val="decimal"/>
+      <w:lvlText w:val=""/>
+      <w:lvlJc w:val="left"/>
+    </w:lvl>
+    <w:lvl w:ilvl="5">
+      <w:numFmt w:val="decimal"/>
+      <w:lvlText w:val=""/>
+      <w:lvlJc w:val="left"/>
+    </w:lvl>
+    <w:lvl w:ilvl="6">
+      <w:numFmt w:val="decimal"/>
+      <w:lvlText w:val=""/>
+      <w:lvlJc w:val="left"/>
+    </w:lvl>
+    <w:lvl w:ilvl="7">
+      <w:numFmt w:val="decimal"/>
+      <w:lvlText w:val=""/>
+      <w:lvlJc w:val="left"/>
+    </w:lvl>
+    <w:lvl w:ilvl="8">
+      <w:numFmt w:val="decimal"/>
+      <w:lvlText w:val=""/>
+      <w:lvlJc w:val="left"/>
+    </w:lvl>
   </w:abstractNum>
   <w:num w:numId="1">
-    <w:abstractNumId w:val="1"/>
+    <w:abstractNumId w:val="0"/>
   </w:num>
   <w:num w:numId="2">
-    <w:abstractNumId w:val="2"/>
+    <w:abstractNumId w:val="1"/>
   </w:num>
 </w:numbering>
 </file>
 
 <file path=word/styles.xml><?xml version="1.0" encoding="utf-8"?>
-<w:styles xmlns:w="http://schemas.openxmlformats.org/wordprocessingml/2006/main" xmlns:w14="http://schemas.microsoft.com/office/word/2010/wordml" xmlns:mc="http://schemas.openxmlformats.org/markup-compatibility/2006" mc:Ignorable="w14">
+<w:styles xmlns:mc="http://schemas.openxmlformats.org/markup-compatibility/2006" xmlns:r="http://schemas.openxmlformats.org/officeDocument/2006/relationships" xmlns:w="http://schemas.openxmlformats.org/wordprocessingml/2006/main" xmlns:w14="http://schemas.microsoft.com/office/word/2010/wordml" xmlns:w15="http://schemas.microsoft.com/office/word/2012/wordml" xmlns:w16cex="http://schemas.microsoft.com/office/word/2018/wordml/cex" xmlns:w16cid="http://schemas.microsoft.com/office/word/2016/wordml/cid" xmlns:w16="http://schemas.microsoft.com/office/word/2018/wordml" xmlns:w16sdtdh="http://schemas.microsoft.com/office/word/2020/wordml/sdtdatahash" xmlns:w16se="http://schemas.microsoft.com/office/word/2015/wordml/symex" mc:Ignorable="w14 w15 w16se w16cid w16 w16cex w16sdtdh">
   <w:docDefaults>
     <w:rPrDefault>
       <w:rPr>
-        <w:rFonts w:ascii="Liberation Serif" w:hAnsi="Liberation Serif" w:eastAsia="Noto Serif CJK SC" w:cs="FreeSans"/>
-        <w:sz w:val="24"/>
-        <w:szCs w:val="24"/>
-        <w:lang w:val="en-US" w:eastAsia="zh-CN" w:bidi="hi-IN"/>
+        <w:rFonts w:ascii="Liberation Serif" w:eastAsia="Noto Serif CJK SC" w:hAnsi="Liberation Serif" w:cs="FreeSans"/>
+        <w:lang w:val="es-CL" w:eastAsia="es-CL" w:bidi="ar-SA"/>
       </w:rPr>
     </w:rPrDefault>
-    <w:pPrDefault>
-      <w:pPr>
-        <w:suppressAutoHyphens w:val="true"/>
-      </w:pPr>
-    </w:pPrDefault>
+    <w:pPrDefault/>
   </w:docDefaults>
-  <w:style w:type="paragraph" w:styleId="Normal">
+  <w:latentStyles w:defLockedState="0" w:defUIPriority="99" w:defSemiHidden="0" w:defUnhideWhenUsed="0" w:defQFormat="0" w:count="376">
+    <w:lsdException w:name="Normal" w:uiPriority="0" w:qFormat="1"/>
+    <w:lsdException w:name="heading 1" w:uiPriority="9" w:qFormat="1"/>
+    <w:lsdException w:name="heading 2" w:semiHidden="1" w:uiPriority="9" w:unhideWhenUsed="1" w:qFormat="1"/>
+    <w:lsdException w:name="heading 3" w:semiHidden="1" w:uiPriority="9" w:unhideWhenUsed="1" w:qFormat="1"/>
+    <w:lsdException w:name="heading 4" w:semiHidden="1" w:uiPriority="9" w:unhideWhenUsed="1" w:qFormat="1"/>
+    <w:lsdException w:name="heading 5" w:semiHidden="1" w:uiPriority="9" w:unhideWhenUsed="1" w:qFormat="1"/>
+    <w:lsdException w:name="heading 6" w:semiHidden="1" w:uiPriority="9" w:unhideWhenUsed="1" w:qFormat="1"/>
+    <w:lsdException w:name="heading 7" w:semiHidden="1" w:uiPriority="9" w:unhideWhenUsed="1" w:qFormat="1"/>
+    <w:lsdException w:name="heading 8" w:semiHidden="1" w:uiPriority="9" w:unhideWhenUsed="1" w:qFormat="1"/>
+    <w:lsdException w:name="heading 9" w:semiHidden="1" w:uiPriority="9" w:unhideWhenUsed="1" w:qFormat="1"/>
+    <w:lsdException w:name="index 1" w:semiHidden="1" w:unhideWhenUsed="1"/>
+    <w:lsdException w:name="index 2" w:semiHidden="1" w:unhideWhenUsed="1"/>
+    <w:lsdException w:name="index 3" w:semiHidden="1" w:unhideWhenUsed="1"/>
+    <w:lsdException w:name="index 4" w:semiHidden="1" w:unhideWhenUsed="1"/>
+    <w:lsdException w:name="index 5" w:semiHidden="1" w:unhideWhenUsed="1"/>
+    <w:lsdException w:name="index 6" w:semiHidden="1" w:unhideWhenUsed="1"/>
+    <w:lsdException w:name="index 7" w:semiHidden="1" w:unhideWhenUsed="1"/>
+    <w:lsdException w:name="index 8" w:semiHidden="1" w:unhideWhenUsed="1"/>
+    <w:lsdException w:name="index 9" w:semiHidden="1" w:unhideWhenUsed="1"/>
+    <w:lsdException w:name="toc 1" w:semiHidden="1" w:uiPriority="39" w:unhideWhenUsed="1"/>
+    <w:lsdException w:name="toc 2" w:semiHidden="1" w:uiPriority="39" w:unhideWhenUsed="1"/>
+    <w:lsdException w:name="toc 3" w:semiHidden="1" w:uiPriority="39" w:unhideWhenUsed="1"/>
+    <w:lsdException w:name="toc 4" w:semiHidden="1" w:uiPriority="39" w:unhideWhenUsed="1"/>
+    <w:lsdException w:name="toc 5" w:semiHidden="1" w:uiPriority="39" w:unhideWhenUsed="1"/>
+    <w:lsdException w:name="toc 6" w:semiHidden="1" w:uiPriority="39" w:unhideWhenUsed="1"/>
+    <w:lsdException w:name="toc 7" w:semiHidden="1" w:uiPriority="39" w:unhideWhenUsed="1"/>
+    <w:lsdException w:name="toc 8" w:semiHidden="1" w:uiPriority="39" w:unhideWhenUsed="1"/>
+    <w:lsdException w:name="toc 9" w:semiHidden="1" w:uiPriority="39" w:unhideWhenUsed="1"/>
+    <w:lsdException w:name="Normal Indent" w:semiHidden="1" w:unhideWhenUsed="1"/>
+    <w:lsdException w:name="footnote text" w:semiHidden="1" w:unhideWhenUsed="1"/>
+    <w:lsdException w:name="annotation text" w:semiHidden="1" w:unhideWhenUsed="1"/>
+    <w:lsdException w:name="header" w:semiHidden="1" w:unhideWhenUsed="1"/>
+    <w:lsdException w:name="footer" w:semiHidden="1" w:unhideWhenUsed="1"/>
+    <w:lsdException w:name="index heading" w:semiHidden="1" w:unhideWhenUsed="1"/>
+    <w:lsdException w:name="caption" w:semiHidden="1" w:uiPriority="35" w:unhideWhenUsed="1" w:qFormat="1"/>
+    <w:lsdException w:name="table of figures" w:semiHidden="1" w:unhideWhenUsed="1"/>
+    <w:lsdException w:name="envelope address" w:semiHidden="1" w:unhideWhenUsed="1"/>
+    <w:lsdException w:name="envelope return" w:semiHidden="1" w:unhideWhenUsed="1"/>
+    <w:lsdException w:name="footnote reference" w:semiHidden="1" w:unhideWhenUsed="1"/>
+    <w:lsdException w:name="annotation reference" w:semiHidden="1" w:unhideWhenUsed="1"/>
+    <w:lsdException w:name="line number" w:semiHidden="1" w:unhideWhenUsed="1"/>
+    <w:lsdException w:name="page number" w:semiHidden="1" w:unhideWhenUsed="1"/>
+    <w:lsdException w:name="endnote reference" w:semiHidden="1" w:unhideWhenUsed="1"/>
+    <w:lsdException w:name="endnote text" w:semiHidden="1" w:unhideWhenUsed="1"/>
+    <w:lsdException w:name="table of authorities" w:semiHidden="1" w:unhideWhenUsed="1"/>
+    <w:lsdException w:name="macro" w:semiHidden="1" w:unhideWhenUsed="1"/>
+    <w:lsdException w:name="toa heading" w:semiHidden="1" w:unhideWhenUsed="1"/>
+    <w:lsdException w:name="List" w:semiHidden="1" w:unhideWhenUsed="1"/>
+    <w:lsdException w:name="List Bullet" w:semiHidden="1" w:unhideWhenUsed="1"/>
+    <w:lsdException w:name="List Number" w:semiHidden="1" w:unhideWhenUsed="1"/>
+    <w:lsdException w:name="List 2" w:semiHidden="1" w:unhideWhenUsed="1"/>
+    <w:lsdException w:name="List 3" w:semiHidden="1" w:unhideWhenUsed="1"/>
+    <w:lsdException w:name="List 4" w:semiHidden="1" w:unhideWhenUsed="1"/>
+    <w:lsdException w:name="List 5" w:semiHidden="1" w:unhideWhenUsed="1"/>
+    <w:lsdException w:name="List Bullet 2" w:semiHidden="1" w:unhideWhenUsed="1"/>
+    <w:lsdException w:name="List Bullet 3" w:semiHidden="1" w:unhideWhenUsed="1"/>
+    <w:lsdException w:name="List Bullet 4" w:semiHidden="1" w:unhideWhenUsed="1"/>
+    <w:lsdException w:name="List Bullet 5" w:semiHidden="1" w:unhideWhenUsed="1"/>
+    <w:lsdException w:name="List Number 2" w:semiHidden="1" w:unhideWhenUsed="1"/>
+    <w:lsdException w:name="List Number 3" w:semiHidden="1" w:unhideWhenUsed="1"/>
+    <w:lsdException w:name="List Number 4" w:semiHidden="1" w:unhideWhenUsed="1"/>
+    <w:lsdException w:name="List Number 5" w:semiHidden="1" w:unhideWhenUsed="1"/>
+    <w:lsdException w:name="Title" w:uiPriority="10" w:qFormat="1"/>
+    <w:lsdException w:name="Closing" w:semiHidden="1" w:unhideWhenUsed="1"/>
+    <w:lsdException w:name="Signature" w:semiHidden="1" w:unhideWhenUsed="1"/>
+    <w:lsdException w:name="Default Paragraph Font" w:semiHidden="1" w:uiPriority="1" w:unhideWhenUsed="1"/>
+    <w:lsdException w:name="Body Text" w:semiHidden="1" w:unhideWhenUsed="1"/>
+    <w:lsdException w:name="Body Text Indent" w:semiHidden="1" w:unhideWhenUsed="1"/>
+    <w:lsdException w:name="List Continue" w:semiHidden="1" w:unhideWhenUsed="1"/>
+    <w:lsdException w:name="List Continue 2" w:semiHidden="1" w:unhideWhenUsed="1"/>
+    <w:lsdException w:name="List Continue 3" w:semiHidden="1" w:unhideWhenUsed="1"/>
+    <w:lsdException w:name="List Continue 4" w:semiHidden="1" w:unhideWhenUsed="1"/>
+    <w:lsdException w:name="List Continue 5" w:semiHidden="1" w:unhideWhenUsed="1"/>
+    <w:lsdException w:name="Message Header" w:semiHidden="1" w:unhideWhenUsed="1"/>
+    <w:lsdException w:name="Subtitle" w:uiPriority="11" w:qFormat="1"/>
+    <w:lsdException w:name="Salutation" w:semiHidden="1" w:unhideWhenUsed="1"/>
+    <w:lsdException w:name="Date" w:semiHidden="1" w:unhideWhenUsed="1"/>
+    <w:lsdException w:name="Body Text First Indent" w:semiHidden="1" w:unhideWhenUsed="1"/>
+    <w:lsdException w:name="Body Text First Indent 2" w:semiHidden="1" w:unhideWhenUsed="1"/>
+    <w:lsdException w:name="Note Heading" w:semiHidden="1" w:unhideWhenUsed="1"/>
+    <w:lsdException w:name="Body Text 2" w:semiHidden="1" w:unhideWhenUsed="1"/>
+    <w:lsdException w:name="Body Text 3" w:semiHidden="1" w:unhideWhenUsed="1"/>
+    <w:lsdException w:name="Body Text Indent 2" w:semiHidden="1" w:unhideWhenUsed="1"/>
+    <w:lsdException w:name="Body Text Indent 3" w:semiHidden="1" w:unhideWhenUsed="1"/>
+    <w:lsdException w:name="Block Text" w:semiHidden="1" w:unhideWhenUsed="1"/>
+    <w:lsdException w:name="Hyperlink" w:semiHidden="1" w:unhideWhenUsed="1"/>
+    <w:lsdException w:name="FollowedHyperlink" w:semiHidden="1" w:unhideWhenUsed="1"/>
+    <w:lsdException w:name="Strong" w:uiPriority="22" w:qFormat="1"/>
+    <w:lsdException w:name="Emphasis" w:uiPriority="20" w:qFormat="1"/>
+    <w:lsdException w:name="Document Map" w:semiHidden="1" w:unhideWhenUsed="1"/>
+    <w:lsdException w:name="Plain Text" w:semiHidden="1" w:unhideWhenUsed="1"/>
+    <w:lsdException w:name="E-mail Signature" w:semiHidden="1" w:unhideWhenUsed="1"/>
+    <w:lsdException w:name="HTML Top of Form" w:semiHidden="1" w:unhideWhenUsed="1"/>
+    <w:lsdException w:name="HTML Bottom of Form" w:semiHidden="1" w:unhideWhenUsed="1"/>
+    <w:lsdException w:name="Normal (Web)" w:semiHidden="1" w:unhideWhenUsed="1"/>
+    <w:lsdException w:name="HTML Acronym" w:semiHidden="1" w:unhideWhenUsed="1"/>
+    <w:lsdException w:name="HTML Address" w:semiHidden="1" w:unhideWhenUsed="1"/>
+    <w:lsdException w:name="HTML Cite" w:semiHidden="1" w:unhideWhenUsed="1"/>
+    <w:lsdException w:name="HTML Code" w:semiHidden="1" w:unhideWhenUsed="1"/>
+    <w:lsdException w:name="HTML Definition" w:semiHidden="1" w:unhideWhenUsed="1"/>
+    <w:lsdException w:name="HTML Keyboard" w:semiHidden="1" w:unhideWhenUsed="1"/>
+    <w:lsdException w:name="HTML Preformatted" w:semiHidden="1" w:unhideWhenUsed="1"/>
+    <w:lsdException w:name="HTML Sample" w:semiHidden="1" w:unhideWhenUsed="1"/>
+    <w:lsdException w:name="HTML Typewriter" w:semiHidden="1" w:unhideWhenUsed="1"/>
+    <w:lsdException w:name="HTML Variable" w:semiHidden="1" w:unhideWhenUsed="1"/>
+    <w:lsdException w:name="Normal Table" w:semiHidden="1" w:unhideWhenUsed="1"/>
+    <w:lsdException w:name="annotation subject" w:semiHidden="1" w:unhideWhenUsed="1"/>
+    <w:lsdException w:name="No List" w:semiHidden="1" w:unhideWhenUsed="1"/>
+    <w:lsdException w:name="Outline List 1" w:semiHidden="1" w:unhideWhenUsed="1"/>
+    <w:lsdException w:name="Outline List 2" w:semiHidden="1" w:unhideWhenUsed="1"/>
+    <w:lsdException w:name="Outline List 3" w:semiHidden="1" w:unhideWhenUsed="1"/>
+    <w:lsdException w:name="Table Simple 1" w:semiHidden="1" w:unhideWhenUsed="1"/>
+    <w:lsdException w:name="Table Simple 2" w:semiHidden="1" w:unhideWhenUsed="1"/>
+    <w:lsdException w:name="Table Simple 3" w:semiHidden="1" w:unhideWhenUsed="1"/>
+    <w:lsdException w:name="Table Classic 1" w:semiHidden="1" w:unhideWhenUsed="1"/>
+    <w:lsdException w:name="Table Classic 2" w:semiHidden="1" w:unhideWhenUsed="1"/>
+    <w:lsdException w:name="Table Classic 3" w:semiHidden="1" w:unhideWhenUsed="1"/>
+    <w:lsdException w:name="Table Classic 4" w:semiHidden="1" w:unhideWhenUsed="1"/>
+    <w:lsdException w:name="Table Colorful 1" w:semiHidden="1" w:unhideWhenUsed="1"/>
+    <w:lsdException w:name="Table Colorful 2" w:semiHidden="1" w:unhideWhenUsed="1"/>
+    <w:lsdException w:name="Table Colorful 3" w:semiHidden="1" w:unhideWhenUsed="1"/>
+    <w:lsdException w:name="Table Columns 1" w:semiHidden="1" w:unhideWhenUsed="1"/>
+    <w:lsdException w:name="Table Columns 2" w:semiHidden="1" w:unhideWhenUsed="1"/>
+    <w:lsdException w:name="Table Columns 3" w:semiHidden="1" w:unhideWhenUsed="1"/>
+    <w:lsdException w:name="Table Columns 4" w:semiHidden="1" w:unhideWhenUsed="1"/>
+    <w:lsdException w:name="Table Columns 5" w:semiHidden="1" w:unhideWhenUsed="1"/>
+    <w:lsdException w:name="Table Grid 1" w:semiHidden="1" w:unhideWhenUsed="1"/>
+    <w:lsdException w:name="Table Grid 2" w:semiHidden="1" w:unhideWhenUsed="1"/>
+    <w:lsdException w:name="Table Grid 3" w:semiHidden="1" w:unhideWhenUsed="1"/>
+    <w:lsdException w:name="Table Grid 4" w:semiHidden="1" w:unhideWhenUsed="1"/>
+    <w:lsdException w:name="Table Grid 5" w:semiHidden="1" w:unhideWhenUsed="1"/>
+    <w:lsdException w:name="Table Grid 6" w:semiHidden="1" w:unhideWhenUsed="1"/>
+    <w:lsdException w:name="Table Grid 7" w:semiHidden="1" w:unhideWhenUsed="1"/>
+    <w:lsdException w:name="Table Grid 8" w:semiHidden="1" w:unhideWhenUsed="1"/>
+    <w:lsdException w:name="Table List 1" w:semiHidden="1" w:unhideWhenUsed="1"/>
+    <w:lsdException w:name="Table List 2" w:semiHidden="1" w:unhideWhenUsed="1"/>
+    <w:lsdException w:name="Table List 3" w:semiHidden="1" w:unhideWhenUsed="1"/>
+    <w:lsdException w:name="Table List 4" w:semiHidden="1" w:unhideWhenUsed="1"/>
+    <w:lsdException w:name="Table List 5" w:semiHidden="1" w:unhideWhenUsed="1"/>
+    <w:lsdException w:name="Table List 6" w:semiHidden="1" w:unhideWhenUsed="1"/>
+    <w:lsdException w:name="Table List 7" w:semiHidden="1" w:unhideWhenUsed="1"/>
+    <w:lsdException w:name="Table List 8" w:semiHidden="1" w:unhideWhenUsed="1"/>
+    <w:lsdException w:name="Table 3D effects 1" w:semiHidden="1" w:unhideWhenUsed="1"/>
+    <w:lsdException w:name="Table 3D effects 2" w:semiHidden="1" w:unhideWhenUsed="1"/>
+    <w:lsdException w:name="Table 3D effects 3" w:semiHidden="1" w:unhideWhenUsed="1"/>
+    <w:lsdException w:name="Table Contemporary" w:semiHidden="1" w:unhideWhenUsed="1"/>
+    <w:lsdException w:name="Table Elegant" w:semiHidden="1" w:unhideWhenUsed="1"/>
+    <w:lsdException w:name="Table Professional" w:semiHidden="1" w:unhideWhenUsed="1"/>
+    <w:lsdException w:name="Table Subtle 1" w:semiHidden="1" w:unhideWhenUsed="1"/>
+    <w:lsdException w:name="Table Subtle 2" w:semiHidden="1" w:unhideWhenUsed="1"/>
+    <w:lsdException w:name="Table Web 1" w:semiHidden="1" w:unhideWhenUsed="1"/>
+    <w:lsdException w:name="Table Web 2" w:semiHidden="1" w:unhideWhenUsed="1"/>
+    <w:lsdException w:name="Table Web 3" w:semiHidden="1" w:unhideWhenUsed="1"/>
+    <w:lsdException w:name="Balloon Text" w:semiHidden="1" w:unhideWhenUsed="1"/>
+    <w:lsdException w:name="Table Grid" w:uiPriority="39"/>
+    <w:lsdException w:name="Table Theme" w:semiHidden="1" w:unhideWhenUsed="1"/>
+    <w:lsdException w:name="Placeholder Text" w:semiHidden="1"/>
+    <w:lsdException w:name="No Spacing" w:uiPriority="1" w:qFormat="1"/>
+    <w:lsdException w:name="Light Shading" w:uiPriority="60"/>
+    <w:lsdException w:name="Light List" w:uiPriority="61"/>
+    <w:lsdException w:name="Light Grid" w:uiPriority="62"/>
+    <w:lsdException w:name="Medium Shading 1" w:uiPriority="63"/>
+    <w:lsdException w:name="Medium Shading 2" w:uiPriority="64"/>
+    <w:lsdException w:name="Medium List 1" w:uiPriority="65"/>
+    <w:lsdException w:name="Medium List 2" w:uiPriority="66"/>
+    <w:lsdException w:name="Medium Grid 1" w:uiPriority="67"/>
+    <w:lsdException w:name="Medium Grid 2" w:uiPriority="68"/>
+    <w:lsdException w:name="Medium Grid 3" w:uiPriority="69"/>
+    <w:lsdException w:name="Dark List" w:uiPriority="70"/>
+    <w:lsdException w:name="Colorful Shading" w:uiPriority="71"/>
+    <w:lsdException w:name="Colorful List" w:uiPriority="72"/>
+    <w:lsdException w:name="Colorful Grid" w:uiPriority="73"/>
+    <w:lsdException w:name="Light Shading Accent 1" w:uiPriority="60"/>
+    <w:lsdException w:name="Light List Accent 1" w:uiPriority="61"/>
+    <w:lsdException w:name="Light Grid Accent 1" w:uiPriority="62"/>
+    <w:lsdException w:name="Medium Shading 1 Accent 1" w:uiPriority="63"/>
+    <w:lsdException w:name="Medium Shading 2 Accent 1" w:uiPriority="64"/>
+    <w:lsdException w:name="Medium List 1 Accent 1" w:uiPriority="65"/>
+    <w:lsdException w:name="Revision" w:semiHidden="1"/>
+    <w:lsdException w:name="List Paragraph" w:uiPriority="34" w:qFormat="1"/>
+    <w:lsdException w:name="Quote" w:uiPriority="29" w:qFormat="1"/>
+    <w:lsdException w:name="Intense Quote" w:uiPriority="30" w:qFormat="1"/>
+    <w:lsdException w:name="Medium List 2 Accent 1" w:uiPriority="66"/>
+    <w:lsdException w:name="Medium Grid 1 Accent 1" w:uiPriority="67"/>
+    <w:lsdException w:name="Medium Grid 2 Accent 1" w:uiPriority="68"/>
+    <w:lsdException w:name="Medium Grid 3 Accent 1" w:uiPriority="69"/>
+    <w:lsdException w:name="Dark List Accent 1" w:uiPriority="70"/>
+    <w:lsdException w:name="Colorful Shading Accent 1" w:uiPriority="71"/>
+    <w:lsdException w:name="Colorful List Accent 1" w:uiPriority="72"/>
+    <w:lsdException w:name="Colorful Grid Accent 1" w:uiPriority="73"/>
+    <w:lsdException w:name="Light Shading Accent 2" w:uiPriority="60"/>
+    <w:lsdException w:name="Light List Accent 2" w:uiPriority="61"/>
+    <w:lsdException w:name="Light Grid Accent 2" w:uiPriority="62"/>
+    <w:lsdException w:name="Medium Shading 1 Accent 2" w:uiPriority="63"/>
+    <w:lsdException w:name="Medium Shading 2 Accent 2" w:uiPriority="64"/>
+    <w:lsdException w:name="Medium List 1 Accent 2" w:uiPriority="65"/>
+    <w:lsdException w:name="Medium List 2 Accent 2" w:uiPriority="66"/>
+    <w:lsdException w:name="Medium Grid 1 Accent 2" w:uiPriority="67"/>
+    <w:lsdException w:name="Medium Grid 2 Accent 2" w:uiPriority="68"/>
+    <w:lsdException w:name="Medium Grid 3 Accent 2" w:uiPriority="69"/>
+    <w:lsdException w:name="Dark List Accent 2" w:uiPriority="70"/>
+    <w:lsdException w:name="Colorful Shading Accent 2" w:uiPriority="71"/>
+    <w:lsdException w:name="Colorful List Accent 2" w:uiPriority="72"/>
+    <w:lsdException w:name="Colorful Grid Accent 2" w:uiPriority="73"/>
+    <w:lsdException w:name="Light Shading Accent 3" w:uiPriority="60"/>
+    <w:lsdException w:name="Light List Accent 3" w:uiPriority="61"/>
+    <w:lsdException w:name="Light Grid Accent 3" w:uiPriority="62"/>
+    <w:lsdException w:name="Medium Shading 1 Accent 3" w:uiPriority="63"/>
+    <w:lsdException w:name="Medium Shading 2 Accent 3" w:uiPriority="64"/>
+    <w:lsdException w:name="Medium List 1 Accent 3" w:uiPriority="65"/>
+    <w:lsdException w:name="Medium List 2 Accent 3" w:uiPriority="66"/>
+    <w:lsdException w:name="Medium Grid 1 Accent 3" w:uiPriority="67"/>
+    <w:lsdException w:name="Medium Grid 2 Accent 3" w:uiPriority="68"/>
+    <w:lsdException w:name="Medium Grid 3 Accent 3" w:uiPriority="69"/>
+    <w:lsdException w:name="Dark List Accent 3" w:uiPriority="70"/>
+    <w:lsdException w:name="Colorful Shading Accent 3" w:uiPriority="71"/>
+    <w:lsdException w:name="Colorful List Accent 3" w:uiPriority="72"/>
+    <w:lsdException w:name="Colorful Grid Accent 3" w:uiPriority="73"/>
+    <w:lsdException w:name="Light Shading Accent 4" w:uiPriority="60"/>
+    <w:lsdException w:name="Light List Accent 4" w:uiPriority="61"/>
+    <w:lsdException w:name="Light Grid Accent 4" w:uiPriority="62"/>
+    <w:lsdException w:name="Medium Shading 1 Accent 4" w:uiPriority="63"/>
+    <w:lsdException w:name="Medium Shading 2 Accent 4" w:uiPriority="64"/>
+    <w:lsdException w:name="Medium List 1 Accent 4" w:uiPriority="65"/>
+    <w:lsdException w:name="Medium List 2 Accent 4" w:uiPriority="66"/>
+    <w:lsdException w:name="Medium Grid 1 Accent 4" w:uiPriority="67"/>
+    <w:lsdException w:name="Medium Grid 2 Accent 4" w:uiPriority="68"/>
+    <w:lsdException w:name="Medium Grid 3 Accent 4" w:uiPriority="69"/>
+    <w:lsdException w:name="Dark List Accent 4" w:uiPriority="70"/>
+    <w:lsdException w:name="Colorful Shading Accent 4" w:uiPriority="71"/>
+    <w:lsdException w:name="Colorful List Accent 4" w:uiPriority="72"/>
+    <w:lsdException w:name="Colorful Grid Accent 4" w:uiPriority="73"/>
+    <w:lsdException w:name="Light Shading Accent 5" w:uiPriority="60"/>
+    <w:lsdException w:name="Light List Accent 5" w:uiPriority="61"/>
+    <w:lsdException w:name="Light Grid Accent 5" w:uiPriority="62"/>
+    <w:lsdException w:name="Medium Shading 1 Accent 5" w:uiPriority="63"/>
+    <w:lsdException w:name="Medium Shading 2 Accent 5" w:uiPriority="64"/>
+    <w:lsdException w:name="Medium List 1 Accent 5" w:uiPriority="65"/>
+    <w:lsdException w:name="Medium List 2 Accent 5" w:uiPriority="66"/>
+    <w:lsdException w:name="Medium Grid 1 Accent 5" w:uiPriority="67"/>
+    <w:lsdException w:name="Medium Grid 2 Accent 5" w:uiPriority="68"/>
+    <w:lsdException w:name="Medium Grid 3 Accent 5" w:uiPriority="69"/>
+    <w:lsdException w:name="Dark List Accent 5" w:uiPriority="70"/>
+    <w:lsdException w:name="Colorful Shading Accent 5" w:uiPriority="71"/>
+    <w:lsdException w:name="Colorful List Accent 5" w:uiPriority="72"/>
+    <w:lsdException w:name="Colorful Grid Accent 5" w:uiPriority="73"/>
+    <w:lsdException w:name="Light Shading Accent 6" w:uiPriority="60"/>
+    <w:lsdException w:name="Light List Accent 6" w:uiPriority="61"/>
+    <w:lsdException w:name="Light Grid Accent 6" w:uiPriority="62"/>
+    <w:lsdException w:name="Medium Shading 1 Accent 6" w:uiPriority="63"/>
+    <w:lsdException w:name="Medium Shading 2 Accent 6" w:uiPriority="64"/>
+    <w:lsdException w:name="Medium List 1 Accent 6" w:uiPriority="65"/>
+    <w:lsdException w:name="Medium List 2 Accent 6" w:uiPriority="66"/>
+    <w:lsdException w:name="Medium Grid 1 Accent 6" w:uiPriority="67"/>
+    <w:lsdException w:name="Medium Grid 2 Accent 6" w:uiPriority="68"/>
+    <w:lsdException w:name="Medium Grid 3 Accent 6" w:uiPriority="69"/>
+    <w:lsdException w:name="Dark List Accent 6" w:uiPriority="70"/>
+    <w:lsdException w:name="Colorful Shading Accent 6" w:uiPriority="71"/>
+    <w:lsdException w:name="Colorful List Accent 6" w:uiPriority="72"/>
+    <w:lsdException w:name="Colorful Grid Accent 6" w:uiPriority="73"/>
+    <w:lsdException w:name="Subtle Emphasis" w:uiPriority="19" w:qFormat="1"/>
+    <w:lsdException w:name="Intense Emphasis" w:uiPriority="21" w:qFormat="1"/>
+    <w:lsdException w:name="Subtle Reference" w:uiPriority="31" w:qFormat="1"/>
+    <w:lsdException w:name="Intense Reference" w:uiPriority="32" w:qFormat="1"/>
+    <w:lsdException w:name="Book Title" w:uiPriority="33" w:qFormat="1"/>
+    <w:lsdException w:name="Bibliography" w:semiHidden="1" w:uiPriority="37" w:unhideWhenUsed="1"/>
+    <w:lsdException w:name="TOC Heading" w:semiHidden="1" w:uiPriority="39" w:unhideWhenUsed="1" w:qFormat="1"/>
+    <w:lsdException w:name="Plain Table 1" w:uiPriority="41"/>
+    <w:lsdException w:name="Plain Table 2" w:uiPriority="42"/>
+    <w:lsdException w:name="Plain Table 3" w:uiPriority="43"/>
+    <w:lsdException w:name="Plain Table 4" w:uiPriority="44"/>
+    <w:lsdException w:name="Plain Table 5" w:uiPriority="45"/>
+    <w:lsdException w:name="Grid Table Light" w:uiPriority="40"/>
+    <w:lsdException w:name="Grid Table 1 Light" w:uiPriority="46"/>
+    <w:lsdException w:name="Grid Table 2" w:uiPriority="47"/>
+    <w:lsdException w:name="Grid Table 3" w:uiPriority="48"/>
+    <w:lsdException w:name="Grid Table 4" w:uiPriority="49"/>
+    <w:lsdException w:name="Grid Table 5 Dark" w:uiPriority="50"/>
+    <w:lsdException w:name="Grid Table 6 Colorful" w:uiPriority="51"/>
+    <w:lsdException w:name="Grid Table 7 Colorful" w:uiPriority="52"/>
+    <w:lsdException w:name="Grid Table 1 Light Accent 1" w:uiPriority="46"/>
+    <w:lsdException w:name="Grid Table 2 Accent 1" w:uiPriority="47"/>
+    <w:lsdException w:name="Grid Table 3 Accent 1" w:uiPriority="48"/>
+    <w:lsdException w:name="Grid Table 4 Accent 1" w:uiPriority="49"/>
+    <w:lsdException w:name="Grid Table 5 Dark Accent 1" w:uiPriority="50"/>
+    <w:lsdException w:name="Grid Table 6 Colorful Accent 1" w:uiPriority="51"/>
+    <w:lsdException w:name="Grid Table 7 Colorful Accent 1" w:uiPriority="52"/>
+    <w:lsdException w:name="Grid Table 1 Light Accent 2" w:uiPriority="46"/>
+    <w:lsdException w:name="Grid Table 2 Accent 2" w:uiPriority="47"/>
+    <w:lsdException w:name="Grid Table 3 Accent 2" w:uiPriority="48"/>
+    <w:lsdException w:name="Grid Table 4 Accent 2" w:uiPriority="49"/>
+    <w:lsdException w:name="Grid Table 5 Dark Accent 2" w:uiPriority="50"/>
+    <w:lsdException w:name="Grid Table 6 Colorful Accent 2" w:uiPriority="51"/>
+    <w:lsdException w:name="Grid Table 7 Colorful Accent 2" w:uiPriority="52"/>
+    <w:lsdException w:name="Grid Table 1 Light Accent 3" w:uiPriority="46"/>
+    <w:lsdException w:name="Grid Table 2 Accent 3" w:uiPriority="47"/>
+    <w:lsdException w:name="Grid Table 3 Accent 3" w:uiPriority="48"/>
+    <w:lsdException w:name="Grid Table 4 Accent 3" w:uiPriority="49"/>
+    <w:lsdException w:name="Grid Table 5 Dark Accent 3" w:uiPriority="50"/>
+    <w:lsdException w:name="Grid Table 6 Colorful Accent 3" w:uiPriority="51"/>
+    <w:lsdException w:name="Grid Table 7 Colorful Accent 3" w:uiPriority="52"/>
+    <w:lsdException w:name="Grid Table 1 Light Accent 4" w:uiPriority="46"/>
+    <w:lsdException w:name="Grid Table 2 Accent 4" w:uiPriority="47"/>
+    <w:lsdException w:name="Grid Table 3 Accent 4" w:uiPriority="48"/>
+    <w:lsdException w:name="Grid Table 4 Accent 4" w:uiPriority="49"/>
+    <w:lsdException w:name="Grid Table 5 Dark Accent 4" w:uiPriority="50"/>
+    <w:lsdException w:name="Grid Table 6 Colorful Accent 4" w:uiPriority="51"/>
+    <w:lsdException w:name="Grid Table 7 Colorful Accent 4" w:uiPriority="52"/>
+    <w:lsdException w:name="Grid Table 1 Light Accent 5" w:uiPriority="46"/>
+    <w:lsdException w:name="Grid Table 2 Accent 5" w:uiPriority="47"/>
+    <w:lsdException w:name="Grid Table 3 Accent 5" w:uiPriority="48"/>
+    <w:lsdException w:name="Grid Table 4 Accent 5" w:uiPriority="49"/>
+    <w:lsdException w:name="Grid Table 5 Dark Accent 5" w:uiPriority="50"/>
+    <w:lsdException w:name="Grid Table 6 Colorful Accent 5" w:uiPriority="51"/>
+    <w:lsdException w:name="Grid Table 7 Colorful Accent 5" w:uiPriority="52"/>
+    <w:lsdException w:name="Grid Table 1 Light Accent 6" w:uiPriority="46"/>
+    <w:lsdException w:name="Grid Table 2 Accent 6" w:uiPriority="47"/>
+    <w:lsdException w:name="Grid Table 3 Accent 6" w:uiPriority="48"/>
+    <w:lsdException w:name="Grid Table 4 Accent 6" w:uiPriority="49"/>
+    <w:lsdException w:name="Grid Table 5 Dark Accent 6" w:uiPriority="50"/>
+    <w:lsdException w:name="Grid Table 6 Colorful Accent 6" w:uiPriority="51"/>
+    <w:lsdException w:name="Grid Table 7 Colorful Accent 6" w:uiPriority="52"/>
+    <w:lsdException w:name="List Table 1 Light" w:uiPriority="46"/>
+    <w:lsdException w:name="List Table 2" w:uiPriority="47"/>
+    <w:lsdException w:name="List Table 3" w:uiPriority="48"/>
+    <w:lsdException w:name="List Table 4" w:uiPriority="49"/>
+    <w:lsdException w:name="List Table 5 Dark" w:uiPriority="50"/>
+    <w:lsdException w:name="List Table 6 Colorful" w:uiPriority="51"/>
+    <w:lsdException w:name="List Table 7 Colorful" w:uiPriority="52"/>
+    <w:lsdException w:name="List Table 1 Light Accent 1" w:uiPriority="46"/>
+    <w:lsdException w:name="List Table 2 Accent 1" w:uiPriority="47"/>
+    <w:lsdException w:name="List Table 3 Accent 1" w:uiPriority="48"/>
+    <w:lsdException w:name="List Table 4 Accent 1" w:uiPriority="49"/>
+    <w:lsdException w:name="List Table 5 Dark Accent 1" w:uiPriority="50"/>
+    <w:lsdException w:name="List Table 6 Colorful Accent 1" w:uiPriority="51"/>
+    <w:lsdException w:name="List Table 7 Colorful Accent 1" w:uiPriority="52"/>
+    <w:lsdException w:name="List Table 1 Light Accent 2" w:uiPriority="46"/>
+    <w:lsdException w:name="List Table 2 Accent 2" w:uiPriority="47"/>
+    <w:lsdException w:name="List Table 3 Accent 2" w:uiPriority="48"/>
+    <w:lsdException w:name="List Table 4 Accent 2" w:uiPriority="49"/>
+    <w:lsdException w:name="List Table 5 Dark Accent 2" w:uiPriority="50"/>
+    <w:lsdException w:name="List Table 6 Colorful Accent 2" w:uiPriority="51"/>
+    <w:lsdException w:name="List Table 7 Colorful Accent 2" w:uiPriority="52"/>
+    <w:lsdException w:name="List Table 1 Light Accent 3" w:uiPriority="46"/>
+    <w:lsdException w:name="List Table 2 Accent 3" w:uiPriority="47"/>
+    <w:lsdException w:name="List Table 3 Accent 3" w:uiPriority="48"/>
+    <w:lsdException w:name="List Table 4 Accent 3" w:uiPriority="49"/>
+    <w:lsdException w:name="List Table 5 Dark Accent 3" w:uiPriority="50"/>
+    <w:lsdException w:name="List Table 6 Colorful Accent 3" w:uiPriority="51"/>
+    <w:lsdException w:name="List Table 7 Colorful Accent 3" w:uiPriority="52"/>
+    <w:lsdException w:name="List Table 1 Light Accent 4" w:uiPriority="46"/>
+    <w:lsdException w:name="List Table 2 Accent 4" w:uiPriority="47"/>
+    <w:lsdException w:name="List Table 3 Accent 4" w:uiPriority="48"/>
+    <w:lsdException w:name="List Table 4 Accent 4" w:uiPriority="49"/>
+    <w:lsdException w:name="List Table 5 Dark Accent 4" w:uiPriority="50"/>
+    <w:lsdException w:name="List Table 6 Colorful Accent 4" w:uiPriority="51"/>
+    <w:lsdException w:name="List Table 7 Colorful Accent 4" w:uiPriority="52"/>
+    <w:lsdException w:name="List Table 1 Light Accent 5" w:uiPriority="46"/>
+    <w:lsdException w:name="List Table 2 Accent 5" w:uiPriority="47"/>
+    <w:lsdException w:name="List Table 3 Accent 5" w:uiPriority="48"/>
+    <w:lsdException w:name="List Table 4 Accent 5" w:uiPriority="49"/>
+    <w:lsdException w:name="List Table 5 Dark Accent 5" w:uiPriority="50"/>
+    <w:lsdException w:name="List Table 6 Colorful Accent 5" w:uiPriority="51"/>
+    <w:lsdException w:name="List Table 7 Colorful Accent 5" w:uiPriority="52"/>
+    <w:lsdException w:name="List Table 1 Light Accent 6" w:uiPriority="46"/>
+    <w:lsdException w:name="List Table 2 Accent 6" w:uiPriority="47"/>
+    <w:lsdException w:name="List Table 3 Accent 6" w:uiPriority="48"/>
+    <w:lsdException w:name="List Table 4 Accent 6" w:uiPriority="49"/>
+    <w:lsdException w:name="List Table 5 Dark Accent 6" w:uiPriority="50"/>
+    <w:lsdException w:name="List Table 6 Colorful Accent 6" w:uiPriority="51"/>
+    <w:lsdException w:name="List Table 7 Colorful Accent 6" w:uiPriority="52"/>
+    <w:lsdException w:name="Mention" w:semiHidden="1" w:unhideWhenUsed="1"/>
+    <w:lsdException w:name="Smart Hyperlink" w:semiHidden="1" w:unhideWhenUsed="1"/>
+    <w:lsdException w:name="Hashtag" w:semiHidden="1" w:unhideWhenUsed="1"/>
+    <w:lsdException w:name="Unresolved Mention" w:semiHidden="1" w:unhideWhenUsed="1"/>
+    <w:lsdException w:name="Smart Link" w:semiHidden="1" w:unhideWhenUsed="1"/>
+  </w:latentStyles>
+  <w:style w:type="paragraph" w:default="1" w:styleId="Normal">
     <w:name w:val="Normal"/>
     <w:qFormat/>
     <w:pPr>
-      <w:widowControl/>
-      <w:bidi w:val="0"/>
-      <w:spacing w:lineRule="auto" w:line="276" w:before="0" w:after="200"/>
+      <w:suppressAutoHyphens/>
+      <w:spacing w:after="200" w:line="276" w:lineRule="auto"/>
     </w:pPr>
     <w:rPr>
-      <w:rFonts w:ascii="Calibri" w:hAnsi="Calibri" w:eastAsia="Calibri" w:cs="Times New Roman"/>
-      <w:color w:val="auto"/>
+      <w:rFonts w:ascii="Calibri" w:eastAsia="Calibri" w:hAnsi="Calibri" w:cs="Times New Roman"/>
       <w:sz w:val="22"/>
       <w:szCs w:val="22"/>
-      <w:lang w:val="es-VE" w:bidi="ar-SA" w:eastAsia="zh-CN"/>
-    </w:rPr>
-  </w:style>
-  <w:style w:type="paragraph" w:styleId="Heading1">
-    <w:name w:val="Heading 1"/>
+      <w:lang w:val="es-VE" w:eastAsia="zh-CN"/>
+    </w:rPr>
+  </w:style>
+  <w:style w:type="paragraph" w:styleId="Ttulo1">
+    <w:name w:val="heading 1"/>
     <w:basedOn w:val="Normal"/>
-    <w:next w:val="BodyText"/>
+    <w:next w:val="Textoindependiente"/>
+    <w:uiPriority w:val="9"/>
     <w:qFormat/>
     <w:pPr>
       <w:numPr>
-        <w:ilvl w:val="0"/>
         <w:numId w:val="1"/>
       </w:numPr>
-      <w:spacing w:lineRule="auto" w:line="240" w:before="280" w:after="280"/>
+      <w:spacing w:before="280" w:after="280" w:line="240" w:lineRule="auto"/>
       <w:outlineLvl w:val="0"/>
     </w:pPr>
     <w:rPr>
-      <w:rFonts w:ascii="Times New Roman" w:hAnsi="Times New Roman" w:eastAsia="Times New Roman" w:cs="Times New Roman"/>
+      <w:rFonts w:ascii="Times New Roman" w:eastAsia="Times New Roman" w:hAnsi="Times New Roman"/>
       <w:b/>
       <w:bCs/>
       <w:kern w:val="2"/>
@@ -1589,34 +1803,40 @@
       <w:szCs w:val="48"/>
     </w:rPr>
   </w:style>
-  <w:style w:type="paragraph" w:styleId="Heading2">
-    <w:name w:val="Heading 2"/>
+  <w:style w:type="paragraph" w:styleId="Ttulo2">
+    <w:name w:val="heading 2"/>
     <w:basedOn w:val="Normal"/>
-    <w:next w:val="BodyText"/>
+    <w:next w:val="Textoindependiente"/>
+    <w:uiPriority w:val="9"/>
+    <w:semiHidden/>
+    <w:unhideWhenUsed/>
     <w:qFormat/>
     <w:pPr>
       <w:numPr>
         <w:ilvl w:val="1"/>
         <w:numId w:val="1"/>
       </w:numPr>
-      <w:spacing w:lineRule="auto" w:line="240" w:before="280" w:after="280"/>
+      <w:spacing w:before="280" w:after="280" w:line="240" w:lineRule="auto"/>
       <w:outlineLvl w:val="1"/>
     </w:pPr>
     <w:rPr>
-      <w:rFonts w:ascii="Times New Roman" w:hAnsi="Times New Roman" w:eastAsia="Times New Roman" w:cs="Times New Roman"/>
+      <w:rFonts w:ascii="Times New Roman" w:eastAsia="Times New Roman" w:hAnsi="Times New Roman"/>
       <w:b/>
       <w:bCs/>
       <w:sz w:val="36"/>
       <w:szCs w:val="36"/>
     </w:rPr>
   </w:style>
-  <w:style w:type="paragraph" w:styleId="Heading3">
-    <w:name w:val="Heading 3"/>
+  <w:style w:type="paragraph" w:styleId="Ttulo3">
+    <w:name w:val="heading 3"/>
     <w:basedOn w:val="Normal"/>
     <w:next w:val="Normal"/>
+    <w:uiPriority w:val="9"/>
+    <w:semiHidden/>
+    <w:unhideWhenUsed/>
     <w:qFormat/>
     <w:pPr>
-      <w:keepNext w:val="true"/>
+      <w:keepNext/>
       <w:numPr>
         <w:ilvl w:val="2"/>
         <w:numId w:val="1"/>
@@ -1625,67 +1845,88 @@
       <w:outlineLvl w:val="2"/>
     </w:pPr>
     <w:rPr>
-      <w:rFonts w:ascii="Cambria" w:hAnsi="Cambria" w:eastAsia="Times New Roman" w:cs="Times New Roman"/>
+      <w:rFonts w:ascii="Cambria" w:eastAsia="Times New Roman" w:hAnsi="Cambria"/>
       <w:b/>
       <w:bCs/>
       <w:sz w:val="26"/>
       <w:szCs w:val="26"/>
     </w:rPr>
   </w:style>
-  <w:style w:type="character" w:styleId="WW8Num2z0">
+  <w:style w:type="character" w:default="1" w:styleId="Fuentedeprrafopredeter">
+    <w:name w:val="Default Paragraph Font"/>
+    <w:uiPriority w:val="1"/>
+    <w:semiHidden/>
+    <w:unhideWhenUsed/>
+  </w:style>
+  <w:style w:type="table" w:default="1" w:styleId="Tablanormal">
+    <w:name w:val="Normal Table"/>
+    <w:uiPriority w:val="99"/>
+    <w:semiHidden/>
+    <w:unhideWhenUsed/>
+    <w:tblPr>
+      <w:tblInd w:w="0" w:type="dxa"/>
+      <w:tblCellMar>
+        <w:top w:w="0" w:type="dxa"/>
+        <w:left w:w="108" w:type="dxa"/>
+        <w:bottom w:w="0" w:type="dxa"/>
+        <w:right w:w="108" w:type="dxa"/>
+      </w:tblCellMar>
+    </w:tblPr>
+  </w:style>
+  <w:style w:type="numbering" w:default="1" w:styleId="Sinlista">
+    <w:name w:val="No List"/>
+    <w:uiPriority w:val="99"/>
+    <w:semiHidden/>
+    <w:unhideWhenUsed/>
+  </w:style>
+  <w:style w:type="character" w:customStyle="1" w:styleId="WW8Num2z0">
     <w:name w:val="WW8Num2z0"/>
     <w:qFormat/>
     <w:rPr>
       <w:rFonts w:ascii="Symbol" w:hAnsi="Symbol" w:cs="Symbol"/>
     </w:rPr>
   </w:style>
-  <w:style w:type="character" w:styleId="WW8Num2z1">
+  <w:style w:type="character" w:customStyle="1" w:styleId="WW8Num2z1">
     <w:name w:val="WW8Num2z1"/>
     <w:qFormat/>
     <w:rPr>
       <w:rFonts w:ascii="Courier New" w:hAnsi="Courier New" w:cs="Courier New"/>
     </w:rPr>
   </w:style>
-  <w:style w:type="character" w:styleId="WW8Num2z2">
+  <w:style w:type="character" w:customStyle="1" w:styleId="WW8Num2z2">
     <w:name w:val="WW8Num2z2"/>
     <w:qFormat/>
     <w:rPr>
       <w:rFonts w:ascii="Wingdings" w:hAnsi="Wingdings" w:cs="Wingdings"/>
     </w:rPr>
   </w:style>
-  <w:style w:type="character" w:styleId="WW8Num3z0">
+  <w:style w:type="character" w:customStyle="1" w:styleId="WW8Num3z0">
     <w:name w:val="WW8Num3z0"/>
     <w:qFormat/>
     <w:rPr>
       <w:rFonts w:ascii="Symbol" w:hAnsi="Symbol" w:cs="Symbol"/>
     </w:rPr>
   </w:style>
-  <w:style w:type="character" w:styleId="WW8Num3z1">
+  <w:style w:type="character" w:customStyle="1" w:styleId="WW8Num3z1">
     <w:name w:val="WW8Num3z1"/>
     <w:qFormat/>
     <w:rPr>
       <w:rFonts w:ascii="Courier New" w:hAnsi="Courier New" w:cs="Courier New"/>
     </w:rPr>
   </w:style>
-  <w:style w:type="character" w:styleId="WW8Num3z2">
+  <w:style w:type="character" w:customStyle="1" w:styleId="WW8Num3z2">
     <w:name w:val="WW8Num3z2"/>
     <w:qFormat/>
     <w:rPr>
       <w:rFonts w:ascii="Wingdings" w:hAnsi="Wingdings" w:cs="Wingdings"/>
     </w:rPr>
   </w:style>
-  <w:style w:type="character" w:styleId="Fuentedeprrafopredeter">
-    <w:name w:val="Fuente de párrafo predeter."/>
-    <w:qFormat/>
-    <w:rPr/>
-  </w:style>
-  <w:style w:type="character" w:styleId="apple-converted-space">
+  <w:style w:type="character" w:customStyle="1" w:styleId="apple-converted-space">
     <w:name w:val="apple-converted-space"/>
     <w:basedOn w:val="Fuentedeprrafopredeter"/>
     <w:qFormat/>
-    <w:rPr/>
-  </w:style>
-  <w:style w:type="character" w:styleId="Strong">
+  </w:style>
+  <w:style w:type="character" w:styleId="Textoennegrita">
     <w:name w:val="Strong"/>
     <w:qFormat/>
     <w:rPr>
@@ -1693,28 +1934,28 @@
       <w:bCs/>
     </w:rPr>
   </w:style>
-  <w:style w:type="character" w:styleId="Hyperlink">
+  <w:style w:type="character" w:styleId="Hipervnculo">
     <w:name w:val="Hyperlink"/>
     <w:rPr>
       <w:color w:val="0000FF"/>
       <w:u w:val="single"/>
     </w:rPr>
   </w:style>
-  <w:style w:type="character" w:styleId="TextocomentarioCar">
+  <w:style w:type="character" w:customStyle="1" w:styleId="TextocomentarioCar">
     <w:name w:val="Texto comentario Car"/>
     <w:qFormat/>
     <w:rPr>
-      <w:rFonts w:ascii="Times New Roman" w:hAnsi="Times New Roman" w:eastAsia="Times New Roman" w:cs="Times New Roman"/>
+      <w:rFonts w:ascii="Times New Roman" w:eastAsia="Times New Roman" w:hAnsi="Times New Roman" w:cs="Times New Roman"/>
       <w:sz w:val="20"/>
       <w:szCs w:val="20"/>
       <w:lang w:val="en-US"/>
     </w:rPr>
   </w:style>
-  <w:style w:type="character" w:styleId="Ttulo1Car">
+  <w:style w:type="character" w:customStyle="1" w:styleId="Ttulo1Car">
     <w:name w:val="Título 1 Car"/>
     <w:qFormat/>
     <w:rPr>
-      <w:rFonts w:ascii="Times New Roman" w:hAnsi="Times New Roman" w:eastAsia="Times New Roman" w:cs="Times New Roman"/>
+      <w:rFonts w:ascii="Times New Roman" w:eastAsia="Times New Roman" w:hAnsi="Times New Roman" w:cs="Times New Roman"/>
       <w:b/>
       <w:bCs/>
       <w:kern w:val="2"/>
@@ -1722,60 +1963,53 @@
       <w:szCs w:val="48"/>
     </w:rPr>
   </w:style>
-  <w:style w:type="character" w:styleId="Ttulo2Car">
+  <w:style w:type="character" w:customStyle="1" w:styleId="Ttulo2Car">
     <w:name w:val="Título 2 Car"/>
     <w:qFormat/>
     <w:rPr>
-      <w:rFonts w:ascii="Times New Roman" w:hAnsi="Times New Roman" w:eastAsia="Times New Roman" w:cs="Times New Roman"/>
+      <w:rFonts w:ascii="Times New Roman" w:eastAsia="Times New Roman" w:hAnsi="Times New Roman" w:cs="Times New Roman"/>
       <w:b/>
       <w:bCs/>
       <w:sz w:val="36"/>
       <w:szCs w:val="36"/>
     </w:rPr>
   </w:style>
-  <w:style w:type="character" w:styleId="vote-count-post">
+  <w:style w:type="character" w:customStyle="1" w:styleId="vote-count-post">
     <w:name w:val="vote-count-post"/>
     <w:basedOn w:val="Fuentedeprrafopredeter"/>
     <w:qFormat/>
-    <w:rPr/>
-  </w:style>
-  <w:style w:type="character" w:styleId="relativetime">
+  </w:style>
+  <w:style w:type="character" w:customStyle="1" w:styleId="relativetime">
     <w:name w:val="relativetime"/>
     <w:basedOn w:val="Fuentedeprrafopredeter"/>
     <w:qFormat/>
-    <w:rPr/>
-  </w:style>
-  <w:style w:type="character" w:styleId="reputation-score">
+  </w:style>
+  <w:style w:type="character" w:customStyle="1" w:styleId="reputation-score">
     <w:name w:val="reputation-score"/>
     <w:basedOn w:val="Fuentedeprrafopredeter"/>
     <w:qFormat/>
-    <w:rPr/>
-  </w:style>
-  <w:style w:type="character" w:styleId="badgecount">
+  </w:style>
+  <w:style w:type="character" w:customStyle="1" w:styleId="badgecount">
     <w:name w:val="badgecount"/>
     <w:basedOn w:val="Fuentedeprrafopredeter"/>
     <w:qFormat/>
-    <w:rPr/>
-  </w:style>
-  <w:style w:type="character" w:styleId="cool">
+  </w:style>
+  <w:style w:type="character" w:customStyle="1" w:styleId="cool">
     <w:name w:val="cool"/>
     <w:basedOn w:val="Fuentedeprrafopredeter"/>
     <w:qFormat/>
-    <w:rPr/>
-  </w:style>
-  <w:style w:type="character" w:styleId="comment-copy">
+  </w:style>
+  <w:style w:type="character" w:customStyle="1" w:styleId="comment-copy">
     <w:name w:val="comment-copy"/>
     <w:basedOn w:val="Fuentedeprrafopredeter"/>
     <w:qFormat/>
-    <w:rPr/>
-  </w:style>
-  <w:style w:type="character" w:styleId="comment-date">
+  </w:style>
+  <w:style w:type="character" w:customStyle="1" w:styleId="comment-date">
     <w:name w:val="comment-date"/>
     <w:basedOn w:val="Fuentedeprrafopredeter"/>
     <w:qFormat/>
-    <w:rPr/>
-  </w:style>
-  <w:style w:type="character" w:styleId="Emphasis">
+  </w:style>
+  <w:style w:type="character" w:styleId="nfasis">
     <w:name w:val="Emphasis"/>
     <w:qFormat/>
     <w:rPr>
@@ -1783,7 +2017,7 @@
       <w:iCs/>
     </w:rPr>
   </w:style>
-  <w:style w:type="character" w:styleId="TextodegloboCar">
+  <w:style w:type="character" w:customStyle="1" w:styleId="TextodegloboCar">
     <w:name w:val="Texto de globo Car"/>
     <w:qFormat/>
     <w:rPr>
@@ -1792,24 +2026,23 @@
       <w:szCs w:val="16"/>
     </w:rPr>
   </w:style>
-  <w:style w:type="character" w:styleId="Ttulo3Car">
+  <w:style w:type="character" w:customStyle="1" w:styleId="Ttulo3Car">
     <w:name w:val="Título 3 Car"/>
     <w:qFormat/>
     <w:rPr>
-      <w:rFonts w:ascii="Cambria" w:hAnsi="Cambria" w:eastAsia="Times New Roman" w:cs="Times New Roman"/>
+      <w:rFonts w:ascii="Cambria" w:eastAsia="Times New Roman" w:hAnsi="Cambria" w:cs="Times New Roman"/>
       <w:b/>
       <w:bCs/>
       <w:sz w:val="26"/>
       <w:szCs w:val="26"/>
     </w:rPr>
   </w:style>
-  <w:style w:type="character" w:styleId="ilad">
+  <w:style w:type="character" w:customStyle="1" w:styleId="ilad">
     <w:name w:val="il_ad"/>
     <w:basedOn w:val="Fuentedeprrafopredeter"/>
     <w:qFormat/>
-    <w:rPr/>
-  </w:style>
-  <w:style w:type="character" w:styleId="EncabezadoCar">
+  </w:style>
+  <w:style w:type="character" w:customStyle="1" w:styleId="EncabezadoCar">
     <w:name w:val="Encabezado Car"/>
     <w:qFormat/>
     <w:rPr>
@@ -1817,7 +2050,7 @@
       <w:szCs w:val="22"/>
     </w:rPr>
   </w:style>
-  <w:style w:type="character" w:styleId="PiedepginaCar">
+  <w:style w:type="character" w:customStyle="1" w:styleId="PiedepginaCar">
     <w:name w:val="Pie de página Car"/>
     <w:qFormat/>
     <w:rPr>
@@ -1825,39 +2058,37 @@
       <w:szCs w:val="22"/>
     </w:rPr>
   </w:style>
-  <w:style w:type="paragraph" w:styleId="Heading">
+  <w:style w:type="paragraph" w:customStyle="1" w:styleId="Heading">
     <w:name w:val="Heading"/>
     <w:basedOn w:val="Normal"/>
-    <w:next w:val="BodyText"/>
+    <w:next w:val="Textoindependiente"/>
     <w:qFormat/>
     <w:pPr>
-      <w:keepNext w:val="true"/>
+      <w:keepNext/>
       <w:spacing w:before="240" w:after="120"/>
     </w:pPr>
     <w:rPr>
-      <w:rFonts w:ascii="Liberation Sans" w:hAnsi="Liberation Sans" w:eastAsia="Noto Sans CJK SC" w:cs="FreeSans"/>
+      <w:rFonts w:ascii="Liberation Sans" w:eastAsia="Noto Sans CJK SC" w:hAnsi="Liberation Sans" w:cs="FreeSans"/>
       <w:sz w:val="28"/>
       <w:szCs w:val="28"/>
     </w:rPr>
   </w:style>
-  <w:style w:type="paragraph" w:styleId="BodyText">
+  <w:style w:type="paragraph" w:styleId="Textoindependiente">
     <w:name w:val="Body Text"/>
     <w:basedOn w:val="Normal"/>
     <w:pPr>
-      <w:spacing w:lineRule="auto" w:line="276" w:before="0" w:after="140"/>
+      <w:spacing w:after="140"/>
     </w:pPr>
-    <w:rPr/>
-  </w:style>
-  <w:style w:type="paragraph" w:styleId="List">
+  </w:style>
+  <w:style w:type="paragraph" w:styleId="Lista">
     <w:name w:val="List"/>
-    <w:basedOn w:val="BodyText"/>
-    <w:pPr/>
+    <w:basedOn w:val="Textoindependiente"/>
     <w:rPr>
       <w:rFonts w:cs="FreeSans"/>
     </w:rPr>
   </w:style>
-  <w:style w:type="paragraph" w:styleId="Caption">
-    <w:name w:val="Caption"/>
+  <w:style w:type="paragraph" w:styleId="Descripcin">
+    <w:name w:val="caption"/>
     <w:basedOn w:val="Normal"/>
     <w:qFormat/>
     <w:pPr>
@@ -1872,7 +2103,7 @@
       <w:szCs w:val="24"/>
     </w:rPr>
   </w:style>
-  <w:style w:type="paragraph" w:styleId="Index">
+  <w:style w:type="paragraph" w:customStyle="1" w:styleId="Index">
     <w:name w:val="Index"/>
     <w:basedOn w:val="Normal"/>
     <w:qFormat/>
@@ -1888,45 +2119,43 @@
     <w:basedOn w:val="Normal"/>
     <w:qFormat/>
     <w:pPr>
-      <w:spacing w:lineRule="auto" w:line="240" w:before="280" w:after="280"/>
+      <w:spacing w:before="280" w:after="280" w:line="240" w:lineRule="auto"/>
     </w:pPr>
     <w:rPr>
-      <w:rFonts w:ascii="Times New Roman" w:hAnsi="Times New Roman" w:eastAsia="Times New Roman" w:cs="Times New Roman"/>
+      <w:rFonts w:ascii="Times New Roman" w:eastAsia="Times New Roman" w:hAnsi="Times New Roman"/>
       <w:sz w:val="24"/>
       <w:szCs w:val="24"/>
     </w:rPr>
   </w:style>
   <w:style w:type="paragraph" w:styleId="Prrafodelista">
-    <w:name w:val="Párrafo de lista"/>
+    <w:name w:val="List Paragraph"/>
     <w:basedOn w:val="Normal"/>
     <w:qFormat/>
     <w:pPr>
-      <w:spacing w:before="0" w:after="200"/>
-      <w:ind w:hanging="0" w:start="720" w:end="0"/>
+      <w:ind w:left="720"/>
       <w:contextualSpacing/>
     </w:pPr>
-    <w:rPr/>
   </w:style>
   <w:style w:type="paragraph" w:styleId="Textocomentario">
-    <w:name w:val="Texto comentario"/>
+    <w:name w:val="annotation text"/>
     <w:basedOn w:val="Normal"/>
     <w:qFormat/>
     <w:pPr>
-      <w:spacing w:lineRule="auto" w:line="240" w:before="0" w:after="0"/>
+      <w:spacing w:after="0" w:line="240" w:lineRule="auto"/>
     </w:pPr>
     <w:rPr>
-      <w:rFonts w:ascii="Times New Roman" w:hAnsi="Times New Roman" w:eastAsia="Times New Roman" w:cs="Times New Roman"/>
+      <w:rFonts w:ascii="Times New Roman" w:eastAsia="Times New Roman" w:hAnsi="Times New Roman"/>
       <w:sz w:val="20"/>
       <w:szCs w:val="20"/>
       <w:lang w:val="en-US"/>
     </w:rPr>
   </w:style>
   <w:style w:type="paragraph" w:styleId="Textodeglobo">
-    <w:name w:val="Texto de globo"/>
+    <w:name w:val="Balloon Text"/>
     <w:basedOn w:val="Normal"/>
     <w:qFormat/>
     <w:pPr>
-      <w:spacing w:lineRule="auto" w:line="240" w:before="0" w:after="0"/>
+      <w:spacing w:after="0" w:line="240" w:lineRule="auto"/>
     </w:pPr>
     <w:rPr>
       <w:rFonts w:ascii="Tahoma" w:hAnsi="Tahoma" w:cs="Tahoma"/>
@@ -1934,60 +2163,52 @@
       <w:szCs w:val="16"/>
     </w:rPr>
   </w:style>
-  <w:style w:type="paragraph" w:styleId="HeaderandFooter">
+  <w:style w:type="paragraph" w:customStyle="1" w:styleId="HeaderandFooter">
     <w:name w:val="Header and Footer"/>
     <w:basedOn w:val="Normal"/>
     <w:qFormat/>
     <w:pPr>
       <w:suppressLineNumbers/>
       <w:tabs>
-        <w:tab w:val="clear" w:pos="708"/>
-        <w:tab w:val="center" w:pos="4819" w:leader="none"/>
-        <w:tab w:val="right" w:pos="9638" w:leader="none"/>
+        <w:tab w:val="center" w:pos="4819"/>
+        <w:tab w:val="right" w:pos="9638"/>
       </w:tabs>
     </w:pPr>
-    <w:rPr/>
-  </w:style>
-  <w:style w:type="paragraph" w:styleId="Header">
-    <w:name w:val="Header"/>
+  </w:style>
+  <w:style w:type="paragraph" w:styleId="Encabezado">
+    <w:name w:val="header"/>
     <w:basedOn w:val="Normal"/>
     <w:pPr>
       <w:tabs>
-        <w:tab w:val="clear" w:pos="708"/>
-        <w:tab w:val="center" w:pos="4419" w:leader="none"/>
-        <w:tab w:val="right" w:pos="8838" w:leader="none"/>
+        <w:tab w:val="center" w:pos="4419"/>
+        <w:tab w:val="right" w:pos="8838"/>
       </w:tabs>
     </w:pPr>
-    <w:rPr/>
-  </w:style>
-  <w:style w:type="paragraph" w:styleId="Footer">
-    <w:name w:val="Footer"/>
+  </w:style>
+  <w:style w:type="paragraph" w:styleId="Piedepgina">
+    <w:name w:val="footer"/>
     <w:basedOn w:val="Normal"/>
     <w:pPr>
       <w:tabs>
-        <w:tab w:val="clear" w:pos="708"/>
-        <w:tab w:val="center" w:pos="4419" w:leader="none"/>
-        <w:tab w:val="right" w:pos="8838" w:leader="none"/>
+        <w:tab w:val="center" w:pos="4419"/>
+        <w:tab w:val="right" w:pos="8838"/>
       </w:tabs>
     </w:pPr>
-    <w:rPr/>
-  </w:style>
-  <w:style w:type="paragraph" w:styleId="TableContents">
+  </w:style>
+  <w:style w:type="paragraph" w:customStyle="1" w:styleId="TableContents">
     <w:name w:val="Table Contents"/>
     <w:basedOn w:val="Normal"/>
     <w:qFormat/>
     <w:pPr>
-      <w:widowControl w:val="false"/>
+      <w:widowControl w:val="0"/>
       <w:suppressLineNumbers/>
     </w:pPr>
-    <w:rPr/>
-  </w:style>
-  <w:style w:type="paragraph" w:styleId="TableHeading">
+  </w:style>
+  <w:style w:type="paragraph" w:customStyle="1" w:styleId="TableHeading">
     <w:name w:val="Table Heading"/>
     <w:basedOn w:val="TableContents"/>
     <w:qFormat/>
     <w:pPr>
-      <w:suppressLineNumbers/>
       <w:jc w:val="center"/>
     </w:pPr>
     <w:rPr>
@@ -1995,15 +2216,15 @@
       <w:bCs/>
     </w:rPr>
   </w:style>
-  <w:style w:type="numbering" w:styleId="WW8Num1">
+  <w:style w:type="numbering" w:customStyle="1" w:styleId="WW8Num1">
     <w:name w:val="WW8Num1"/>
     <w:qFormat/>
   </w:style>
-  <w:style w:type="numbering" w:styleId="WW8Num2">
+  <w:style w:type="numbering" w:customStyle="1" w:styleId="WW8Num2">
     <w:name w:val="WW8Num2"/>
     <w:qFormat/>
   </w:style>
-  <w:style w:type="numbering" w:styleId="WW8Num3">
+  <w:style w:type="numbering" w:customStyle="1" w:styleId="WW8Num3">
     <w:name w:val="WW8Num3"/>
     <w:qFormat/>
   </w:style>
@@ -2011,56 +2232,56 @@
 </file>
 
 <file path=word/theme/theme1.xml><?xml version="1.0" encoding="utf-8"?>
-<a:theme xmlns:a="http://schemas.openxmlformats.org/drawingml/2006/main" xmlns:r="http://schemas.openxmlformats.org/officeDocument/2006/relationships" name="Office">
+<a:theme xmlns:a="http://schemas.openxmlformats.org/drawingml/2006/main" name="Office">
   <a:themeElements>
     <a:clrScheme name="LibreOffice">
       <a:dk1>
         <a:srgbClr val="000000"/>
       </a:dk1>
       <a:lt1>
-        <a:srgbClr val="ffffff"/>
+        <a:srgbClr val="FFFFFF"/>
       </a:lt1>
       <a:dk2>
         <a:srgbClr val="000000"/>
       </a:dk2>
       <a:lt2>
-        <a:srgbClr val="ffffff"/>
+        <a:srgbClr val="FFFFFF"/>
       </a:lt2>
       <a:accent1>
-        <a:srgbClr val="18a303"/>
+        <a:srgbClr val="18A303"/>
       </a:accent1>
       <a:accent2>
-        <a:srgbClr val="0369a3"/>
+        <a:srgbClr val="0369A3"/>
       </a:accent2>
       <a:accent3>
-        <a:srgbClr val="a33e03"/>
+        <a:srgbClr val="A33E03"/>
       </a:accent3>
       <a:accent4>
-        <a:srgbClr val="8e03a3"/>
+        <a:srgbClr val="8E03A3"/>
       </a:accent4>
       <a:accent5>
-        <a:srgbClr val="c99c00"/>
+        <a:srgbClr val="C99C00"/>
       </a:accent5>
       <a:accent6>
-        <a:srgbClr val="c9211e"/>
+        <a:srgbClr val="C9211E"/>
       </a:accent6>
       <a:hlink>
-        <a:srgbClr val="0000ee"/>
+        <a:srgbClr val="0000EE"/>
       </a:hlink>
       <a:folHlink>
-        <a:srgbClr val="551a8b"/>
+        <a:srgbClr val="551A8B"/>
       </a:folHlink>
     </a:clrScheme>
     <a:fontScheme name="Office">
       <a:majorFont>
-        <a:latin typeface="Arial" pitchFamily="0" charset="1"/>
-        <a:ea typeface="DejaVu Sans" pitchFamily="0" charset="1"/>
-        <a:cs typeface="DejaVu Sans" pitchFamily="0" charset="1"/>
+        <a:latin typeface="Arial"/>
+        <a:ea typeface="DejaVu Sans"/>
+        <a:cs typeface="DejaVu Sans"/>
       </a:majorFont>
       <a:minorFont>
-        <a:latin typeface="Arial" pitchFamily="0" charset="1"/>
-        <a:ea typeface="DejaVu Sans" pitchFamily="0" charset="1"/>
-        <a:cs typeface="DejaVu Sans" pitchFamily="0" charset="1"/>
+        <a:latin typeface="Arial"/>
+        <a:ea typeface="DejaVu Sans"/>
+        <a:cs typeface="DejaVu Sans"/>
       </a:minorFont>
     </a:fontScheme>
     <a:fmtScheme>
@@ -2113,5 +2334,7 @@
       </a:bgFillStyleLst>
     </a:fmtScheme>
   </a:themeElements>
+  <a:objectDefaults/>
+  <a:extraClrSchemeLst/>
 </a:theme>
 </file>
</xml_diff>